<commit_message>
feat: s12 - adiciona documentacao das stored procedures
</commit_message>
<xml_diff>
--- a/docs/documentacao_stored_procedures.docx
+++ b/docs/documentacao_stored_procedures.docx
@@ -1,15 +1,71 @@
 
 <file path=word/document.xml><?xml version="1.0" encoding="utf-8"?>
-<w:document xmlns:wpc="http://schemas.microsoft.com/office/word/2010/wordprocessingCanvas" xmlns:cx="http://schemas.microsoft.com/office/drawing/2014/chartex" xmlns:cx1="http://schemas.microsoft.com/office/drawing/2015/9/8/chartex" xmlns:cx2="http://schemas.microsoft.com/office/drawing/2015/10/21/chartex" xmlns:cx3="http://schemas.microsoft.com/office/drawing/2016/5/9/chartex" xmlns:cx4="http://schemas.microsoft.com/office/drawing/2016/5/10/chartex" xmlns:cx5="http://schemas.microsoft.com/office/drawing/2016/5/11/chartex" xmlns:cx6="http://schemas.microsoft.com/office/drawing/2016/5/12/chartex" xmlns:cx7="http://schemas.microsoft.com/office/drawing/2016/5/13/chartex" xmlns:cx8="http://schemas.microsoft.com/office/drawing/2016/5/14/chartex" xmlns:mc="http://schemas.openxmlformats.org/markup-compatibility/2006" xmlns:aink="http://schemas.microsoft.com/office/drawing/2016/ink" xmlns:am3d="http://schemas.microsoft.com/office/drawing/2017/model3d" xmlns:o="urn:schemas-microsoft-com:office:office" xmlns:oel="http://schemas.microsoft.com/office/2019/extlst" xmlns:r="http://schemas.openxmlformats.org/officeDocument/2006/relationships" xmlns:m="http://schemas.openxmlformats.org/officeDocument/2006/math" xmlns:v="urn:schemas-microsoft-com:vml" xmlns:wp14="http://schemas.microsoft.com/office/word/2010/wordprocessingDrawing" xmlns:wp="http://schemas.openxmlformats.org/drawingml/2006/wordprocessingDrawing" xmlns:w10="urn:schemas-microsoft-com:office:word" xmlns:w="http://schemas.openxmlformats.org/wordprocessingml/2006/main" xmlns:w14="http://schemas.microsoft.com/office/word/2010/wordml" xmlns:w15="http://schemas.microsoft.com/office/word/2012/wordml" xmlns:w16cex="http://schemas.microsoft.com/office/word/2018/wordml/cex" xmlns:w16cid="http://schemas.microsoft.com/office/word/2016/wordml/cid" xmlns:w16="http://schemas.microsoft.com/office/word/2018/wordml" xmlns:w16du="http://schemas.microsoft.com/office/word/2023/wordml/word16du" xmlns:w16sdtdh="http://schemas.microsoft.com/office/word/2020/wordml/sdtdatahash" xmlns:w16sdtfl="http://schemas.microsoft.com/office/word/2024/wordml/sdtformatlock" xmlns:w16se="http://schemas.microsoft.com/office/word/2015/wordml/symex" xmlns:wpg="http://schemas.microsoft.com/office/word/2010/wordprocessingGroup" xmlns:wpi="http://schemas.microsoft.com/office/word/2010/wordprocessingInk" xmlns:wne="http://schemas.microsoft.com/office/word/2006/wordml" xmlns:wps="http://schemas.microsoft.com/office/word/2010/wordprocessingShape" mc:Ignorable="w14 w15 w16se w16cid w16 w16cex w16sdtdh w16sdtfl w16du wp14">
+<w:document xmlns:mc="http://schemas.openxmlformats.org/markup-compatibility/2006" xmlns:ve="http://schemas.openxmlformats.org/markup-compatibility/2006" xmlns:o="urn:schemas-microsoft-com:office:office" xmlns:r="http://schemas.openxmlformats.org/officeDocument/2006/relationships" xmlns:m="http://schemas.openxmlformats.org/officeDocument/2006/math" xmlns:v="urn:schemas-microsoft-com:vml" xmlns:wp="http://schemas.openxmlformats.org/drawingml/2006/wordprocessingDrawing" xmlns:w10="urn:schemas-microsoft-com:office:word" xmlns:w="http://schemas.openxmlformats.org/wordprocessingml/2006/main" xmlns:wne="http://schemas.microsoft.com/office/word/2006/wordml" xmlns:a="http://schemas.openxmlformats.org/drawingml/2006/main" xmlns:pic="http://schemas.openxmlformats.org/drawingml/2006/picture" xmlns:wpg="http://schemas.microsoft.com/office/word/2010/wordprocessingGroup" xmlns:wps="http://schemas.microsoft.com/office/word/2010/wordprocessingShape" xmlns:w14="http://schemas.microsoft.com/office/word/2010/wordml" mc:Ignorable="w14" xml:space="preserve">
   <w:body>
     <w:p>
       <w:pPr>
-        <w:pStyle w:val="Ttulo1"/>
+        <w:pStyle w:val="BodyText"/>
+        <w:spacing w:before="0"/>
+        <w:rPr>
+          <w:rFonts w:ascii="Times New Roman"/>
+        </w:rPr>
+      </w:pPr>
+    </w:p>
+    <w:p>
+      <w:pPr>
+        <w:pStyle w:val="BodyText"/>
+        <w:rPr>
+          <w:rFonts w:ascii="Times New Roman"/>
+        </w:rPr>
+      </w:pPr>
+    </w:p>
+    <w:p>
+      <w:pPr>
+        <w:pStyle w:val="BodyText"/>
+        <w:spacing w:before="0"/>
+        <w:ind w:left="120"/>
+      </w:pPr>
+      <w:r>
+        <w:rPr>
+          <w:color w:val="545454"/>
+        </w:rPr>
+        <w:t>Documentacao de Stored </w:t>
+      </w:r>
+      <w:r>
+        <w:rPr>
+          <w:color w:val="545454"/>
+          <w:spacing w:val="-2"/>
+        </w:rPr>
+        <w:t>Procedures</w:t>
+      </w:r>
+    </w:p>
+    <w:p>
+      <w:pPr>
+        <w:pStyle w:val="Heading1"/>
+      </w:pPr>
+      <w:r>
+        <w:rPr>
+          <w:b w:val="0"/>
+        </w:rPr>
+        <w:br w:type="column"/>
+      </w:r>
+      <w:r>
+        <w:rPr>
+          <w:color w:val="1A1A1A"/>
+          <w:spacing w:val="-2"/>
+        </w:rPr>
+        <w:t>GymPro</w:t>
+      </w:r>
+    </w:p>
+    <w:p>
+      <w:pPr>
+        <w:pStyle w:val="Heading1"/>
+        <w:spacing w:after="0"/>
         <w:sectPr>
           <w:type w:val="continuous"/>
           <w:pgSz w:w="11910" w:h="16840"/>
-          <w:pgMar w:top="1480" w:right="1700" w:bottom="280" w:left="1417" w:header="720" w:footer="720" w:gutter="0"/>
-          <w:cols w:num="2" w:space="720" w:equalWidth="0">
+          <w:pgMar w:top="1480" w:bottom="280" w:left="1417" w:right="1700"/>
+          <w:cols w:num="2" w:equalWidth="0">
             <w:col w:w="3802" w:space="34"/>
             <w:col w:w="4957"/>
           </w:cols>
@@ -18,7 +74,7 @@
     </w:p>
     <w:p>
       <w:pPr>
-        <w:pStyle w:val="Corpodetexto"/>
+        <w:pStyle w:val="BodyText"/>
         <w:spacing w:before="138"/>
         <w:rPr>
           <w:rFonts w:ascii="Arial"/>
@@ -27,33 +83,10 @@
         </w:rPr>
       </w:pPr>
     </w:p>
-    <w:p>
-      <w:pPr>
-        <w:pStyle w:val="Ttulo1"/>
-        <w:jc w:val="center"/>
-      </w:pPr>
-      <w:r>
-        <w:t>GymPro- Documentação de Stored</w:t>
-      </w:r>
-      <w:r>
-        <w:t xml:space="preserve"> Procedures</w:t>
-      </w:r>
-    </w:p>
-    <w:p>
-      <w:pPr>
-        <w:pStyle w:val="Corpodetexto"/>
-        <w:spacing w:before="138"/>
-        <w:rPr>
-          <w:rFonts w:ascii="Arial"/>
-          <w:b/>
-          <w:sz w:val="20"/>
-        </w:rPr>
-      </w:pPr>
-    </w:p>
     <w:tbl>
       <w:tblPr>
-        <w:tblStyle w:val="TableNormal"/>
         <w:tblW w:w="0" w:type="auto"/>
+        <w:jc w:val="left"/>
         <w:tblInd w:w="572" w:type="dxa"/>
         <w:tblBorders>
           <w:top w:val="single" w:sz="4" w:space="0" w:color="EFEFEF"/>
@@ -64,14 +97,20 @@
           <w:insideV w:val="single" w:sz="4" w:space="0" w:color="EFEFEF"/>
         </w:tblBorders>
         <w:tblLayout w:type="fixed"/>
-        <w:tblLook w:val="01E0" w:firstRow="1" w:lastRow="1" w:firstColumn="1" w:lastColumn="1" w:noHBand="0" w:noVBand="0"/>
+        <w:tblCellMar>
+          <w:top w:w="0" w:type="dxa"/>
+          <w:left w:w="0" w:type="dxa"/>
+          <w:bottom w:w="0" w:type="dxa"/>
+          <w:right w:w="0" w:type="dxa"/>
+        </w:tblCellMar>
+        <w:tblLook w:val="01E0"/>
       </w:tblPr>
       <w:tblGrid>
         <w:gridCol w:w="7937"/>
       </w:tblGrid>
       <w:tr>
         <w:trPr>
-          <w:trHeight w:val="475"/>
+          <w:trHeight w:val="475" w:hRule="atLeast"/>
         </w:trPr>
         <w:tc>
           <w:tcPr>
@@ -79,19 +118,16 @@
             <w:tcBorders>
               <w:bottom w:val="nil"/>
             </w:tcBorders>
-          </w:tcPr>
-          <w:p>
-            <w:pPr>
-              <w:pStyle w:val="TableParagraph"/>
-              <w:tabs>
-                <w:tab w:val="center" w:pos="4063"/>
-              </w:tabs>
+            <w:shd w:val="clear" w:color="auto" w:fill="F97216"/>
+          </w:tcPr>
+          <w:p>
+            <w:pPr>
+              <w:pStyle w:val="TableParagraph"/>
               <w:spacing w:before="127"/>
               <w:ind w:left="200"/>
               <w:rPr>
                 <w:rFonts w:ascii="Arial"/>
                 <w:b/>
-                <w:color w:val="000000" w:themeColor="text1"/>
                 <w:sz w:val="20"/>
               </w:rPr>
             </w:pPr>
@@ -99,28 +135,18 @@
               <w:rPr>
                 <w:rFonts w:ascii="Arial"/>
                 <w:b/>
-                <w:color w:val="000000" w:themeColor="text1"/>
+                <w:color w:val="FFFFFF"/>
                 <w:spacing w:val="-2"/>
                 <w:sz w:val="20"/>
               </w:rPr>
               <w:t>Integrantes</w:t>
-            </w:r>
-            <w:r>
-              <w:rPr>
-                <w:rFonts w:ascii="Arial"/>
-                <w:b/>
-                <w:color w:val="000000" w:themeColor="text1"/>
-                <w:spacing w:val="-2"/>
-                <w:sz w:val="20"/>
-              </w:rPr>
-              <w:tab/>
             </w:r>
           </w:p>
         </w:tc>
       </w:tr>
       <w:tr>
         <w:trPr>
-          <w:trHeight w:val="480"/>
+          <w:trHeight w:val="480" w:hRule="atLeast"/>
         </w:trPr>
         <w:tc>
           <w:tcPr>
@@ -129,6 +155,7 @@
               <w:top w:val="nil"/>
               <w:bottom w:val="nil"/>
             </w:tcBorders>
+            <w:shd w:val="clear" w:color="auto" w:fill="FFF7F4"/>
           </w:tcPr>
           <w:p>
             <w:pPr>
@@ -136,20 +163,17 @@
               <w:spacing w:before="132"/>
               <w:ind w:left="200"/>
               <w:rPr>
-                <w:color w:val="000000" w:themeColor="text1"/>
                 <w:sz w:val="20"/>
               </w:rPr>
             </w:pPr>
             <w:r>
               <w:rPr>
-                <w:color w:val="000000" w:themeColor="text1"/>
                 <w:sz w:val="20"/>
               </w:rPr>
-              <w:t xml:space="preserve">Isabelle </w:t>
-            </w:r>
-            <w:r>
-              <w:rPr>
-                <w:color w:val="000000" w:themeColor="text1"/>
+              <w:t>Isabelle </w:t>
+            </w:r>
+            <w:r>
+              <w:rPr>
                 <w:spacing w:val="-2"/>
                 <w:sz w:val="20"/>
               </w:rPr>
@@ -160,7 +184,7 @@
       </w:tr>
       <w:tr>
         <w:trPr>
-          <w:trHeight w:val="480"/>
+          <w:trHeight w:val="480" w:hRule="atLeast"/>
         </w:trPr>
         <w:tc>
           <w:tcPr>
@@ -176,20 +200,17 @@
               <w:spacing w:before="132"/>
               <w:ind w:left="200"/>
               <w:rPr>
-                <w:color w:val="000000" w:themeColor="text1"/>
                 <w:sz w:val="20"/>
               </w:rPr>
             </w:pPr>
             <w:r>
               <w:rPr>
-                <w:color w:val="000000" w:themeColor="text1"/>
                 <w:sz w:val="20"/>
               </w:rPr>
-              <w:t xml:space="preserve">Lais </w:t>
-            </w:r>
-            <w:r>
-              <w:rPr>
-                <w:color w:val="000000" w:themeColor="text1"/>
+              <w:t>Lais </w:t>
+            </w:r>
+            <w:r>
+              <w:rPr>
                 <w:spacing w:val="-2"/>
                 <w:sz w:val="20"/>
               </w:rPr>
@@ -200,7 +221,7 @@
       </w:tr>
       <w:tr>
         <w:trPr>
-          <w:trHeight w:val="480"/>
+          <w:trHeight w:val="480" w:hRule="atLeast"/>
         </w:trPr>
         <w:tc>
           <w:tcPr>
@@ -209,6 +230,7 @@
               <w:top w:val="nil"/>
               <w:bottom w:val="nil"/>
             </w:tcBorders>
+            <w:shd w:val="clear" w:color="auto" w:fill="FFF7F4"/>
           </w:tcPr>
           <w:p>
             <w:pPr>
@@ -216,20 +238,17 @@
               <w:spacing w:before="132"/>
               <w:ind w:left="200"/>
               <w:rPr>
-                <w:color w:val="000000" w:themeColor="text1"/>
                 <w:sz w:val="20"/>
               </w:rPr>
             </w:pPr>
             <w:r>
               <w:rPr>
-                <w:color w:val="000000" w:themeColor="text1"/>
                 <w:sz w:val="20"/>
               </w:rPr>
-              <w:t xml:space="preserve">Marianna </w:t>
-            </w:r>
-            <w:r>
-              <w:rPr>
-                <w:color w:val="000000" w:themeColor="text1"/>
+              <w:t>Marianna </w:t>
+            </w:r>
+            <w:r>
+              <w:rPr>
                 <w:spacing w:val="-2"/>
                 <w:sz w:val="20"/>
               </w:rPr>
@@ -240,7 +259,7 @@
       </w:tr>
       <w:tr>
         <w:trPr>
-          <w:trHeight w:val="480"/>
+          <w:trHeight w:val="480" w:hRule="atLeast"/>
         </w:trPr>
         <w:tc>
           <w:tcPr>
@@ -256,20 +275,17 @@
               <w:spacing w:before="132"/>
               <w:ind w:left="200"/>
               <w:rPr>
-                <w:color w:val="000000" w:themeColor="text1"/>
                 <w:sz w:val="20"/>
               </w:rPr>
             </w:pPr>
             <w:r>
               <w:rPr>
-                <w:color w:val="000000" w:themeColor="text1"/>
                 <w:sz w:val="20"/>
               </w:rPr>
-              <w:t xml:space="preserve">Sophia </w:t>
-            </w:r>
-            <w:r>
-              <w:rPr>
-                <w:color w:val="000000" w:themeColor="text1"/>
+              <w:t>Sophia </w:t>
+            </w:r>
+            <w:r>
+              <w:rPr>
                 <w:spacing w:val="-2"/>
                 <w:sz w:val="20"/>
               </w:rPr>
@@ -280,7 +296,7 @@
       </w:tr>
       <w:tr>
         <w:trPr>
-          <w:trHeight w:val="475"/>
+          <w:trHeight w:val="475" w:hRule="atLeast"/>
         </w:trPr>
         <w:tc>
           <w:tcPr>
@@ -288,6 +304,7 @@
             <w:tcBorders>
               <w:top w:val="nil"/>
             </w:tcBorders>
+            <w:shd w:val="clear" w:color="auto" w:fill="FFF7F4"/>
           </w:tcPr>
           <w:p>
             <w:pPr>
@@ -295,20 +312,17 @@
               <w:spacing w:before="132"/>
               <w:ind w:left="200"/>
               <w:rPr>
-                <w:color w:val="000000" w:themeColor="text1"/>
                 <w:sz w:val="20"/>
               </w:rPr>
             </w:pPr>
             <w:r>
               <w:rPr>
-                <w:color w:val="000000" w:themeColor="text1"/>
                 <w:sz w:val="20"/>
               </w:rPr>
-              <w:t xml:space="preserve">Tauane </w:t>
-            </w:r>
-            <w:r>
-              <w:rPr>
-                <w:color w:val="000000" w:themeColor="text1"/>
+              <w:t>Tauane </w:t>
+            </w:r>
+            <w:r>
+              <w:rPr>
                 <w:spacing w:val="-2"/>
                 <w:sz w:val="20"/>
               </w:rPr>
@@ -320,7 +334,7 @@
     </w:tbl>
     <w:p>
       <w:pPr>
-        <w:pStyle w:val="Corpodetexto"/>
+        <w:pStyle w:val="BodyText"/>
         <w:spacing w:before="0"/>
         <w:rPr>
           <w:rFonts w:ascii="Arial"/>
@@ -331,8 +345,8 @@
     </w:p>
     <w:p>
       <w:pPr>
-        <w:pStyle w:val="Corpodetexto"/>
-        <w:spacing w:before="114"/>
+        <w:pStyle w:val="BodyText"/>
+        <w:spacing w:before="0"/>
         <w:rPr>
           <w:rFonts w:ascii="Arial"/>
           <w:b/>
@@ -342,19 +356,31 @@
     </w:p>
     <w:p>
       <w:pPr>
-        <w:ind w:left="120"/>
+        <w:pStyle w:val="BodyText"/>
+        <w:spacing w:before="114"/>
         <w:rPr>
           <w:rFonts w:ascii="Arial"/>
           <w:b/>
-          <w:color w:val="000000" w:themeColor="text1"/>
           <w:sz w:val="26"/>
         </w:rPr>
       </w:pPr>
-      <w:r>
+    </w:p>
+    <w:p>
+      <w:pPr>
+        <w:spacing w:before="0"/>
+        <w:ind w:left="120" w:right="0" w:firstLine="0"/>
+        <w:jc w:val="left"/>
         <w:rPr>
           <w:rFonts w:ascii="Arial"/>
           <w:b/>
-          <w:color w:val="000000" w:themeColor="text1"/>
+          <w:sz w:val="26"/>
+        </w:rPr>
+      </w:pPr>
+      <w:r>
+        <w:rPr>
+          <w:rFonts w:ascii="Arial"/>
+          <w:b/>
+          <w:color w:val="F97216"/>
           <w:spacing w:val="-2"/>
           <w:sz w:val="26"/>
         </w:rPr>
@@ -364,15 +390,15 @@
     <w:p>
       <w:pPr>
         <w:spacing w:before="257"/>
-        <w:ind w:left="120"/>
-        <w:rPr>
-          <w:color w:val="000000" w:themeColor="text1"/>
+        <w:ind w:left="120" w:right="0" w:firstLine="0"/>
+        <w:jc w:val="left"/>
+        <w:rPr>
           <w:sz w:val="20"/>
         </w:rPr>
       </w:pPr>
       <w:r>
         <w:rPr>
-          <w:color w:val="000000" w:themeColor="text1"/>
+          <w:color w:val="878787"/>
           <w:spacing w:val="-2"/>
           <w:sz w:val="20"/>
         </w:rPr>
@@ -381,7 +407,7 @@
     </w:p>
     <w:p>
       <w:pPr>
-        <w:pStyle w:val="Corpodetexto"/>
+        <w:pStyle w:val="BodyText"/>
         <w:spacing w:before="51"/>
         <w:ind w:left="120"/>
       </w:pPr>
@@ -389,7 +415,7 @@
         <w:rPr>
           <w:color w:val="1A1A1A"/>
         </w:rPr>
-        <w:t xml:space="preserve">Cadastra uma nova matricula no sistema e atualiza o status do aluno para </w:t>
+        <w:t>Cadastra uma nova matricula no sistema e atualiza o status do aluno para </w:t>
       </w:r>
       <w:r>
         <w:rPr>
@@ -402,15 +428,15 @@
     <w:p>
       <w:pPr>
         <w:spacing w:before="186" w:after="33"/>
-        <w:ind w:left="120"/>
-        <w:rPr>
-          <w:color w:val="000000" w:themeColor="text1"/>
+        <w:ind w:left="120" w:right="0" w:firstLine="0"/>
+        <w:jc w:val="left"/>
+        <w:rPr>
           <w:sz w:val="20"/>
         </w:rPr>
       </w:pPr>
       <w:r>
         <w:rPr>
-          <w:color w:val="000000" w:themeColor="text1"/>
+          <w:color w:val="878787"/>
           <w:spacing w:val="-2"/>
           <w:sz w:val="20"/>
         </w:rPr>
@@ -419,8 +445,8 @@
     </w:p>
     <w:tbl>
       <w:tblPr>
-        <w:tblStyle w:val="TableNormal"/>
         <w:tblW w:w="0" w:type="auto"/>
+        <w:jc w:val="left"/>
         <w:tblInd w:w="572" w:type="dxa"/>
         <w:tblBorders>
           <w:top w:val="single" w:sz="4" w:space="0" w:color="EFEFEF"/>
@@ -431,7 +457,13 @@
           <w:insideV w:val="single" w:sz="4" w:space="0" w:color="EFEFEF"/>
         </w:tblBorders>
         <w:tblLayout w:type="fixed"/>
-        <w:tblLook w:val="01E0" w:firstRow="1" w:lastRow="1" w:firstColumn="1" w:lastColumn="1" w:noHBand="0" w:noVBand="0"/>
+        <w:tblCellMar>
+          <w:top w:w="0" w:type="dxa"/>
+          <w:left w:w="0" w:type="dxa"/>
+          <w:bottom w:w="0" w:type="dxa"/>
+          <w:right w:w="0" w:type="dxa"/>
+        </w:tblCellMar>
+        <w:tblLook w:val="01E0"/>
       </w:tblPr>
       <w:tblGrid>
         <w:gridCol w:w="2551"/>
@@ -440,11 +472,12 @@
       </w:tblGrid>
       <w:tr>
         <w:trPr>
-          <w:trHeight w:val="430"/>
+          <w:trHeight w:val="430" w:hRule="atLeast"/>
         </w:trPr>
         <w:tc>
           <w:tcPr>
             <w:tcW w:w="2551" w:type="dxa"/>
+            <w:shd w:val="clear" w:color="auto" w:fill="F97216"/>
           </w:tcPr>
           <w:p>
             <w:pPr>
@@ -459,7 +492,7 @@
               <w:rPr>
                 <w:rFonts w:ascii="Arial"/>
                 <w:b/>
-                <w:color w:val="000000"/>
+                <w:color w:val="FFFFFF"/>
                 <w:spacing w:val="-2"/>
                 <w:sz w:val="18"/>
               </w:rPr>
@@ -470,6 +503,7 @@
         <w:tc>
           <w:tcPr>
             <w:tcW w:w="1984" w:type="dxa"/>
+            <w:shd w:val="clear" w:color="auto" w:fill="F97216"/>
           </w:tcPr>
           <w:p>
             <w:pPr>
@@ -484,7 +518,7 @@
               <w:rPr>
                 <w:rFonts w:ascii="Arial"/>
                 <w:b/>
-                <w:color w:val="000000"/>
+                <w:color w:val="FFFFFF"/>
                 <w:spacing w:val="-4"/>
                 <w:sz w:val="18"/>
               </w:rPr>
@@ -495,6 +529,7 @@
         <w:tc>
           <w:tcPr>
             <w:tcW w:w="3401" w:type="dxa"/>
+            <w:shd w:val="clear" w:color="auto" w:fill="F97216"/>
           </w:tcPr>
           <w:p>
             <w:pPr>
@@ -509,7 +544,7 @@
               <w:rPr>
                 <w:rFonts w:ascii="Arial"/>
                 <w:b/>
-                <w:color w:val="000000"/>
+                <w:color w:val="FFFFFF"/>
                 <w:spacing w:val="-2"/>
                 <w:sz w:val="18"/>
               </w:rPr>
@@ -520,11 +555,12 @@
       </w:tr>
       <w:tr>
         <w:trPr>
-          <w:trHeight w:val="430"/>
+          <w:trHeight w:val="430" w:hRule="atLeast"/>
         </w:trPr>
         <w:tc>
           <w:tcPr>
             <w:tcW w:w="2551" w:type="dxa"/>
+            <w:shd w:val="clear" w:color="auto" w:fill="FFF7F4"/>
           </w:tcPr>
           <w:p>
             <w:pPr>
@@ -545,6 +581,7 @@
         <w:tc>
           <w:tcPr>
             <w:tcW w:w="1984" w:type="dxa"/>
+            <w:shd w:val="clear" w:color="auto" w:fill="FFF7F4"/>
           </w:tcPr>
           <w:p>
             <w:pPr>
@@ -565,19 +602,20 @@
         <w:tc>
           <w:tcPr>
             <w:tcW w:w="3401" w:type="dxa"/>
-          </w:tcPr>
-          <w:p>
-            <w:pPr>
-              <w:pStyle w:val="TableParagraph"/>
-              <w:rPr>
-                <w:sz w:val="18"/>
-              </w:rPr>
-            </w:pPr>
-            <w:r>
-              <w:rPr>
-                <w:sz w:val="18"/>
-              </w:rPr>
-              <w:t xml:space="preserve">ID do </w:t>
+            <w:shd w:val="clear" w:color="auto" w:fill="FFF7F4"/>
+          </w:tcPr>
+          <w:p>
+            <w:pPr>
+              <w:pStyle w:val="TableParagraph"/>
+              <w:rPr>
+                <w:sz w:val="18"/>
+              </w:rPr>
+            </w:pPr>
+            <w:r>
+              <w:rPr>
+                <w:sz w:val="18"/>
+              </w:rPr>
+              <w:t>ID do </w:t>
             </w:r>
             <w:r>
               <w:rPr>
@@ -591,7 +629,7 @@
       </w:tr>
       <w:tr>
         <w:trPr>
-          <w:trHeight w:val="430"/>
+          <w:trHeight w:val="430" w:hRule="atLeast"/>
         </w:trPr>
         <w:tc>
           <w:tcPr>
@@ -648,7 +686,7 @@
               <w:rPr>
                 <w:sz w:val="18"/>
               </w:rPr>
-              <w:t xml:space="preserve">ID do </w:t>
+              <w:t>ID do </w:t>
             </w:r>
             <w:r>
               <w:rPr>
@@ -662,11 +700,12 @@
       </w:tr>
       <w:tr>
         <w:trPr>
-          <w:trHeight w:val="430"/>
+          <w:trHeight w:val="430" w:hRule="atLeast"/>
         </w:trPr>
         <w:tc>
           <w:tcPr>
             <w:tcW w:w="2551" w:type="dxa"/>
+            <w:shd w:val="clear" w:color="auto" w:fill="FFF7F4"/>
           </w:tcPr>
           <w:p>
             <w:pPr>
@@ -687,6 +726,7 @@
         <w:tc>
           <w:tcPr>
             <w:tcW w:w="1984" w:type="dxa"/>
+            <w:shd w:val="clear" w:color="auto" w:fill="FFF7F4"/>
           </w:tcPr>
           <w:p>
             <w:pPr>
@@ -707,19 +747,20 @@
         <w:tc>
           <w:tcPr>
             <w:tcW w:w="3401" w:type="dxa"/>
-          </w:tcPr>
-          <w:p>
-            <w:pPr>
-              <w:pStyle w:val="TableParagraph"/>
-              <w:rPr>
-                <w:sz w:val="18"/>
-              </w:rPr>
-            </w:pPr>
-            <w:r>
-              <w:rPr>
-                <w:sz w:val="18"/>
-              </w:rPr>
-              <w:t xml:space="preserve">Data de inicio da </w:t>
+            <w:shd w:val="clear" w:color="auto" w:fill="FFF7F4"/>
+          </w:tcPr>
+          <w:p>
+            <w:pPr>
+              <w:pStyle w:val="TableParagraph"/>
+              <w:rPr>
+                <w:sz w:val="18"/>
+              </w:rPr>
+            </w:pPr>
+            <w:r>
+              <w:rPr>
+                <w:sz w:val="18"/>
+              </w:rPr>
+              <w:t>Data de inicio da </w:t>
             </w:r>
             <w:r>
               <w:rPr>
@@ -733,7 +774,7 @@
       </w:tr>
       <w:tr>
         <w:trPr>
-          <w:trHeight w:val="430"/>
+          <w:trHeight w:val="430" w:hRule="atLeast"/>
         </w:trPr>
         <w:tc>
           <w:tcPr>
@@ -790,7 +831,7 @@
               <w:rPr>
                 <w:sz w:val="18"/>
               </w:rPr>
-              <w:t xml:space="preserve">Data de </w:t>
+              <w:t>Data de </w:t>
             </w:r>
             <w:r>
               <w:rPr>
@@ -804,11 +845,12 @@
       </w:tr>
       <w:tr>
         <w:trPr>
-          <w:trHeight w:val="430"/>
+          <w:trHeight w:val="430" w:hRule="atLeast"/>
         </w:trPr>
         <w:tc>
           <w:tcPr>
             <w:tcW w:w="2551" w:type="dxa"/>
+            <w:shd w:val="clear" w:color="auto" w:fill="FFF7F4"/>
           </w:tcPr>
           <w:p>
             <w:pPr>
@@ -829,6 +871,7 @@
         <w:tc>
           <w:tcPr>
             <w:tcW w:w="1984" w:type="dxa"/>
+            <w:shd w:val="clear" w:color="auto" w:fill="FFF7F4"/>
           </w:tcPr>
           <w:p>
             <w:pPr>
@@ -849,19 +892,20 @@
         <w:tc>
           <w:tcPr>
             <w:tcW w:w="3401" w:type="dxa"/>
-          </w:tcPr>
-          <w:p>
-            <w:pPr>
-              <w:pStyle w:val="TableParagraph"/>
-              <w:rPr>
-                <w:sz w:val="18"/>
-              </w:rPr>
-            </w:pPr>
-            <w:r>
-              <w:rPr>
-                <w:sz w:val="18"/>
-              </w:rPr>
-              <w:t xml:space="preserve">Forma de </w:t>
+            <w:shd w:val="clear" w:color="auto" w:fill="FFF7F4"/>
+          </w:tcPr>
+          <w:p>
+            <w:pPr>
+              <w:pStyle w:val="TableParagraph"/>
+              <w:rPr>
+                <w:sz w:val="18"/>
+              </w:rPr>
+            </w:pPr>
+            <w:r>
+              <w:rPr>
+                <w:sz w:val="18"/>
+              </w:rPr>
+              <w:t>Forma de </w:t>
             </w:r>
             <w:r>
               <w:rPr>
@@ -875,7 +919,7 @@
       </w:tr>
       <w:tr>
         <w:trPr>
-          <w:trHeight w:val="430"/>
+          <w:trHeight w:val="430" w:hRule="atLeast"/>
         </w:trPr>
         <w:tc>
           <w:tcPr>
@@ -932,7 +976,7 @@
               <w:rPr>
                 <w:sz w:val="18"/>
               </w:rPr>
-              <w:t xml:space="preserve">Valor </w:t>
+              <w:t>Valor </w:t>
             </w:r>
             <w:r>
               <w:rPr>
@@ -948,22 +992,22 @@
     <w:p>
       <w:pPr>
         <w:spacing w:before="207"/>
-        <w:ind w:left="120"/>
-        <w:rPr>
-          <w:color w:val="000000" w:themeColor="text1"/>
+        <w:ind w:left="120" w:right="0" w:firstLine="0"/>
+        <w:jc w:val="left"/>
+        <w:rPr>
           <w:sz w:val="20"/>
         </w:rPr>
       </w:pPr>
       <w:r>
         <w:rPr>
-          <w:color w:val="000000" w:themeColor="text1"/>
+          <w:color w:val="878787"/>
           <w:sz w:val="20"/>
         </w:rPr>
-        <w:t xml:space="preserve">Regras de </w:t>
-      </w:r>
-      <w:r>
-        <w:rPr>
-          <w:color w:val="000000" w:themeColor="text1"/>
+        <w:t>Regras de </w:t>
+      </w:r>
+      <w:r>
+        <w:rPr>
+          <w:color w:val="878787"/>
           <w:spacing w:val="-2"/>
           <w:sz w:val="20"/>
         </w:rPr>
@@ -972,160 +1016,195 @@
     </w:p>
     <w:p>
       <w:pPr>
-        <w:pStyle w:val="PargrafodaLista"/>
+        <w:pStyle w:val="ListParagraph"/>
         <w:numPr>
           <w:ilvl w:val="0"/>
           <w:numId w:val="1"/>
         </w:numPr>
         <w:tabs>
-          <w:tab w:val="left" w:pos="254"/>
+          <w:tab w:pos="254" w:val="left" w:leader="none"/>
         </w:tabs>
-        <w:spacing w:before="51"/>
-        <w:ind w:hanging="134"/>
+        <w:spacing w:line="240" w:lineRule="auto" w:before="51" w:after="0"/>
+        <w:ind w:left="254" w:right="0" w:hanging="134"/>
+        <w:jc w:val="left"/>
+        <w:rPr>
+          <w:sz w:val="22"/>
+        </w:rPr>
       </w:pPr>
       <w:r>
         <w:rPr>
           <w:color w:val="1A1A1A"/>
-        </w:rPr>
-        <w:t xml:space="preserve">Verifica se o aluno </w:t>
+          <w:sz w:val="22"/>
+        </w:rPr>
+        <w:t>Verifica se o aluno </w:t>
       </w:r>
       <w:r>
         <w:rPr>
           <w:color w:val="1A1A1A"/>
           <w:spacing w:val="-2"/>
+          <w:sz w:val="22"/>
         </w:rPr>
         <w:t>existe.</w:t>
       </w:r>
     </w:p>
     <w:p>
       <w:pPr>
-        <w:pStyle w:val="PargrafodaLista"/>
+        <w:pStyle w:val="ListParagraph"/>
         <w:numPr>
           <w:ilvl w:val="0"/>
           <w:numId w:val="1"/>
         </w:numPr>
         <w:tabs>
-          <w:tab w:val="left" w:pos="254"/>
+          <w:tab w:pos="254" w:val="left" w:leader="none"/>
         </w:tabs>
-        <w:ind w:hanging="134"/>
+        <w:spacing w:line="240" w:lineRule="auto" w:before="67" w:after="0"/>
+        <w:ind w:left="254" w:right="0" w:hanging="134"/>
+        <w:jc w:val="left"/>
+        <w:rPr>
+          <w:sz w:val="22"/>
+        </w:rPr>
       </w:pPr>
       <w:r>
         <w:rPr>
           <w:color w:val="1A1A1A"/>
-        </w:rPr>
-        <w:t xml:space="preserve">Verifica se o plano </w:t>
+          <w:sz w:val="22"/>
+        </w:rPr>
+        <w:t>Verifica se o plano </w:t>
       </w:r>
       <w:r>
         <w:rPr>
           <w:color w:val="1A1A1A"/>
           <w:spacing w:val="-2"/>
+          <w:sz w:val="22"/>
         </w:rPr>
         <w:t>existe.</w:t>
       </w:r>
     </w:p>
     <w:p>
       <w:pPr>
-        <w:pStyle w:val="PargrafodaLista"/>
+        <w:pStyle w:val="ListParagraph"/>
         <w:numPr>
           <w:ilvl w:val="0"/>
           <w:numId w:val="1"/>
         </w:numPr>
         <w:tabs>
-          <w:tab w:val="left" w:pos="254"/>
+          <w:tab w:pos="254" w:val="left" w:leader="none"/>
         </w:tabs>
-        <w:ind w:hanging="134"/>
+        <w:spacing w:line="240" w:lineRule="auto" w:before="67" w:after="0"/>
+        <w:ind w:left="254" w:right="0" w:hanging="134"/>
+        <w:jc w:val="left"/>
+        <w:rPr>
+          <w:sz w:val="22"/>
+        </w:rPr>
       </w:pPr>
       <w:r>
         <w:rPr>
           <w:color w:val="1A1A1A"/>
-        </w:rPr>
-        <w:t xml:space="preserve">Impede o cadastro se o aluno ja tiver uma matricula </w:t>
+          <w:sz w:val="22"/>
+        </w:rPr>
+        <w:t>Impede o cadastro se o aluno ja tiver uma matricula </w:t>
       </w:r>
       <w:r>
         <w:rPr>
           <w:color w:val="1A1A1A"/>
           <w:spacing w:val="-2"/>
+          <w:sz w:val="22"/>
         </w:rPr>
         <w:t>ativa.</w:t>
       </w:r>
     </w:p>
     <w:p>
       <w:pPr>
-        <w:pStyle w:val="PargrafodaLista"/>
+        <w:pStyle w:val="ListParagraph"/>
         <w:numPr>
           <w:ilvl w:val="0"/>
           <w:numId w:val="1"/>
         </w:numPr>
         <w:tabs>
-          <w:tab w:val="left" w:pos="254"/>
+          <w:tab w:pos="254" w:val="left" w:leader="none"/>
         </w:tabs>
-        <w:ind w:hanging="134"/>
+        <w:spacing w:line="240" w:lineRule="auto" w:before="67" w:after="0"/>
+        <w:ind w:left="254" w:right="0" w:hanging="134"/>
+        <w:jc w:val="left"/>
+        <w:rPr>
+          <w:sz w:val="22"/>
+        </w:rPr>
       </w:pPr>
       <w:r>
         <w:rPr>
           <w:color w:val="1A1A1A"/>
-        </w:rPr>
-        <w:t xml:space="preserve">Insere a matricula com status </w:t>
+          <w:sz w:val="22"/>
+        </w:rPr>
+        <w:t>Insere a matricula com status </w:t>
       </w:r>
       <w:r>
         <w:rPr>
           <w:color w:val="1A1A1A"/>
           <w:spacing w:val="-2"/>
+          <w:sz w:val="22"/>
         </w:rPr>
         <w:t>ATIVA.</w:t>
       </w:r>
     </w:p>
     <w:p>
       <w:pPr>
-        <w:pStyle w:val="PargrafodaLista"/>
+        <w:pStyle w:val="ListParagraph"/>
         <w:numPr>
           <w:ilvl w:val="0"/>
           <w:numId w:val="1"/>
         </w:numPr>
         <w:tabs>
-          <w:tab w:val="left" w:pos="254"/>
+          <w:tab w:pos="254" w:val="left" w:leader="none"/>
         </w:tabs>
-        <w:ind w:hanging="134"/>
+        <w:spacing w:line="240" w:lineRule="auto" w:before="67" w:after="0"/>
+        <w:ind w:left="254" w:right="0" w:hanging="134"/>
+        <w:jc w:val="left"/>
+        <w:rPr>
+          <w:sz w:val="22"/>
+        </w:rPr>
       </w:pPr>
       <w:r>
         <w:rPr>
           <w:color w:val="1A1A1A"/>
-        </w:rPr>
-        <w:t xml:space="preserve">Atualiza o status do aluno para </w:t>
+          <w:sz w:val="22"/>
+        </w:rPr>
+        <w:t>Atualiza o status do aluno para </w:t>
       </w:r>
       <w:r>
         <w:rPr>
           <w:color w:val="1A1A1A"/>
           <w:spacing w:val="-2"/>
+          <w:sz w:val="22"/>
         </w:rPr>
         <w:t>ATIVO.</w:t>
       </w:r>
     </w:p>
     <w:p>
       <w:pPr>
-        <w:pStyle w:val="Corpodetexto"/>
+        <w:pStyle w:val="BodyText"/>
         <w:spacing w:before="0"/>
       </w:pPr>
     </w:p>
     <w:p>
       <w:pPr>
-        <w:pStyle w:val="Corpodetexto"/>
+        <w:pStyle w:val="BodyText"/>
         <w:spacing w:before="0"/>
       </w:pPr>
     </w:p>
     <w:p>
       <w:pPr>
-        <w:pStyle w:val="Corpodetexto"/>
+        <w:pStyle w:val="BodyText"/>
         <w:spacing w:before="111"/>
       </w:pPr>
     </w:p>
     <w:p>
       <w:pPr>
-        <w:ind w:left="120"/>
+        <w:spacing w:before="0"/>
+        <w:ind w:left="120" w:right="0" w:firstLine="0"/>
+        <w:jc w:val="left"/>
         <w:rPr>
           <w:rFonts w:ascii="Arial"/>
           <w:b/>
-          <w:color w:val="000000" w:themeColor="text1"/>
           <w:sz w:val="26"/>
         </w:rPr>
       </w:pPr>
@@ -1133,7 +1212,7 @@
         <w:rPr>
           <w:rFonts w:ascii="Arial"/>
           <w:b/>
-          <w:color w:val="000000" w:themeColor="text1"/>
+          <w:color w:val="F97216"/>
           <w:spacing w:val="-2"/>
           <w:sz w:val="26"/>
         </w:rPr>
@@ -1143,15 +1222,15 @@
     <w:p>
       <w:pPr>
         <w:spacing w:before="257"/>
-        <w:ind w:left="120"/>
-        <w:rPr>
-          <w:color w:val="000000" w:themeColor="text1"/>
+        <w:ind w:left="120" w:right="0" w:firstLine="0"/>
+        <w:jc w:val="left"/>
+        <w:rPr>
           <w:sz w:val="20"/>
         </w:rPr>
       </w:pPr>
       <w:r>
         <w:rPr>
-          <w:color w:val="000000" w:themeColor="text1"/>
+          <w:color w:val="878787"/>
           <w:spacing w:val="-2"/>
           <w:sz w:val="20"/>
         </w:rPr>
@@ -1160,7 +1239,7 @@
     </w:p>
     <w:p>
       <w:pPr>
-        <w:pStyle w:val="Corpodetexto"/>
+        <w:pStyle w:val="BodyText"/>
         <w:spacing w:before="52"/>
         <w:ind w:left="120"/>
       </w:pPr>
@@ -1168,7 +1247,7 @@
         <w:rPr>
           <w:color w:val="1A1A1A"/>
         </w:rPr>
-        <w:t xml:space="preserve">Cancela uma matricula existente e atualiza o status do aluno para inativo se </w:t>
+        <w:t>Cancela uma matricula existente e atualiza o status do aluno para inativo se </w:t>
       </w:r>
       <w:r>
         <w:rPr>
@@ -1180,38 +1259,37 @@
     </w:p>
     <w:p>
       <w:pPr>
-        <w:pStyle w:val="Corpodetexto"/>
+        <w:pStyle w:val="BodyText"/>
+        <w:spacing w:after="0"/>
         <w:sectPr>
           <w:type w:val="continuous"/>
           <w:pgSz w:w="11910" w:h="16840"/>
-          <w:pgMar w:top="1480" w:right="1700" w:bottom="280" w:left="1417" w:header="720" w:footer="720" w:gutter="0"/>
-          <w:cols w:space="720"/>
+          <w:pgMar w:top="1480" w:bottom="280" w:left="1417" w:right="1700"/>
         </w:sectPr>
       </w:pPr>
     </w:p>
     <w:p>
       <w:pPr>
         <w:spacing w:before="72" w:after="33"/>
-        <w:ind w:left="120"/>
-        <w:rPr>
-          <w:color w:val="000000" w:themeColor="text1"/>
+        <w:ind w:left="120" w:right="0" w:firstLine="0"/>
+        <w:jc w:val="left"/>
+        <w:rPr>
           <w:sz w:val="20"/>
         </w:rPr>
       </w:pPr>
       <w:r>
         <w:rPr>
-          <w:color w:val="000000" w:themeColor="text1"/>
+          <w:color w:val="878787"/>
           <w:spacing w:val="-2"/>
           <w:sz w:val="20"/>
         </w:rPr>
-        <w:lastRenderedPageBreak/>
         <w:t>Parametros</w:t>
       </w:r>
     </w:p>
     <w:tbl>
       <w:tblPr>
-        <w:tblStyle w:val="TableNormal"/>
         <w:tblW w:w="0" w:type="auto"/>
+        <w:jc w:val="left"/>
         <w:tblInd w:w="572" w:type="dxa"/>
         <w:tblBorders>
           <w:top w:val="single" w:sz="4" w:space="0" w:color="EFEFEF"/>
@@ -1222,7 +1300,13 @@
           <w:insideV w:val="single" w:sz="4" w:space="0" w:color="EFEFEF"/>
         </w:tblBorders>
         <w:tblLayout w:type="fixed"/>
-        <w:tblLook w:val="01E0" w:firstRow="1" w:lastRow="1" w:firstColumn="1" w:lastColumn="1" w:noHBand="0" w:noVBand="0"/>
+        <w:tblCellMar>
+          <w:top w:w="0" w:type="dxa"/>
+          <w:left w:w="0" w:type="dxa"/>
+          <w:bottom w:w="0" w:type="dxa"/>
+          <w:right w:w="0" w:type="dxa"/>
+        </w:tblCellMar>
+        <w:tblLook w:val="01E0"/>
       </w:tblPr>
       <w:tblGrid>
         <w:gridCol w:w="2551"/>
@@ -1231,11 +1315,12 @@
       </w:tblGrid>
       <w:tr>
         <w:trPr>
-          <w:trHeight w:val="430"/>
+          <w:trHeight w:val="430" w:hRule="atLeast"/>
         </w:trPr>
         <w:tc>
           <w:tcPr>
             <w:tcW w:w="2551" w:type="dxa"/>
+            <w:shd w:val="clear" w:color="auto" w:fill="F97216"/>
           </w:tcPr>
           <w:p>
             <w:pPr>
@@ -1243,7 +1328,6 @@
               <w:rPr>
                 <w:rFonts w:ascii="Arial"/>
                 <w:b/>
-                <w:color w:val="000000" w:themeColor="text1"/>
                 <w:sz w:val="18"/>
               </w:rPr>
             </w:pPr>
@@ -1251,7 +1335,7 @@
               <w:rPr>
                 <w:rFonts w:ascii="Arial"/>
                 <w:b/>
-                <w:color w:val="000000" w:themeColor="text1"/>
+                <w:color w:val="FFFFFF"/>
                 <w:spacing w:val="-2"/>
                 <w:sz w:val="18"/>
               </w:rPr>
@@ -1262,6 +1346,7 @@
         <w:tc>
           <w:tcPr>
             <w:tcW w:w="1984" w:type="dxa"/>
+            <w:shd w:val="clear" w:color="auto" w:fill="F97216"/>
           </w:tcPr>
           <w:p>
             <w:pPr>
@@ -1269,7 +1354,6 @@
               <w:rPr>
                 <w:rFonts w:ascii="Arial"/>
                 <w:b/>
-                <w:color w:val="000000" w:themeColor="text1"/>
                 <w:sz w:val="18"/>
               </w:rPr>
             </w:pPr>
@@ -1277,7 +1361,7 @@
               <w:rPr>
                 <w:rFonts w:ascii="Arial"/>
                 <w:b/>
-                <w:color w:val="000000" w:themeColor="text1"/>
+                <w:color w:val="FFFFFF"/>
                 <w:spacing w:val="-4"/>
                 <w:sz w:val="18"/>
               </w:rPr>
@@ -1288,6 +1372,7 @@
         <w:tc>
           <w:tcPr>
             <w:tcW w:w="3401" w:type="dxa"/>
+            <w:shd w:val="clear" w:color="auto" w:fill="F97216"/>
           </w:tcPr>
           <w:p>
             <w:pPr>
@@ -1295,7 +1380,6 @@
               <w:rPr>
                 <w:rFonts w:ascii="Arial"/>
                 <w:b/>
-                <w:color w:val="000000" w:themeColor="text1"/>
                 <w:sz w:val="18"/>
               </w:rPr>
             </w:pPr>
@@ -1303,7 +1387,7 @@
               <w:rPr>
                 <w:rFonts w:ascii="Arial"/>
                 <w:b/>
-                <w:color w:val="000000" w:themeColor="text1"/>
+                <w:color w:val="FFFFFF"/>
                 <w:spacing w:val="-2"/>
                 <w:sz w:val="18"/>
               </w:rPr>
@@ -1314,23 +1398,22 @@
       </w:tr>
       <w:tr>
         <w:trPr>
-          <w:trHeight w:val="430"/>
+          <w:trHeight w:val="430" w:hRule="atLeast"/>
         </w:trPr>
         <w:tc>
           <w:tcPr>
             <w:tcW w:w="2551" w:type="dxa"/>
-          </w:tcPr>
-          <w:p>
-            <w:pPr>
-              <w:pStyle w:val="TableParagraph"/>
-              <w:rPr>
-                <w:color w:val="000000" w:themeColor="text1"/>
-                <w:sz w:val="18"/>
-              </w:rPr>
-            </w:pPr>
-            <w:r>
-              <w:rPr>
-                <w:color w:val="000000" w:themeColor="text1"/>
+            <w:shd w:val="clear" w:color="auto" w:fill="FFF7F4"/>
+          </w:tcPr>
+          <w:p>
+            <w:pPr>
+              <w:pStyle w:val="TableParagraph"/>
+              <w:rPr>
+                <w:sz w:val="18"/>
+              </w:rPr>
+            </w:pPr>
+            <w:r>
+              <w:rPr>
                 <w:spacing w:val="-2"/>
                 <w:sz w:val="18"/>
               </w:rPr>
@@ -1341,18 +1424,17 @@
         <w:tc>
           <w:tcPr>
             <w:tcW w:w="1984" w:type="dxa"/>
-          </w:tcPr>
-          <w:p>
-            <w:pPr>
-              <w:pStyle w:val="TableParagraph"/>
-              <w:rPr>
-                <w:color w:val="000000" w:themeColor="text1"/>
-                <w:sz w:val="18"/>
-              </w:rPr>
-            </w:pPr>
-            <w:r>
-              <w:rPr>
-                <w:color w:val="000000" w:themeColor="text1"/>
+            <w:shd w:val="clear" w:color="auto" w:fill="FFF7F4"/>
+          </w:tcPr>
+          <w:p>
+            <w:pPr>
+              <w:pStyle w:val="TableParagraph"/>
+              <w:rPr>
+                <w:sz w:val="18"/>
+              </w:rPr>
+            </w:pPr>
+            <w:r>
+              <w:rPr>
                 <w:spacing w:val="-2"/>
                 <w:sz w:val="18"/>
               </w:rPr>
@@ -1363,25 +1445,23 @@
         <w:tc>
           <w:tcPr>
             <w:tcW w:w="3401" w:type="dxa"/>
-          </w:tcPr>
-          <w:p>
-            <w:pPr>
-              <w:pStyle w:val="TableParagraph"/>
-              <w:rPr>
-                <w:color w:val="000000" w:themeColor="text1"/>
-                <w:sz w:val="18"/>
-              </w:rPr>
-            </w:pPr>
-            <w:r>
-              <w:rPr>
-                <w:color w:val="000000" w:themeColor="text1"/>
-                <w:sz w:val="18"/>
-              </w:rPr>
-              <w:t xml:space="preserve">ID da matricula a ser </w:t>
-            </w:r>
-            <w:r>
-              <w:rPr>
-                <w:color w:val="000000" w:themeColor="text1"/>
+            <w:shd w:val="clear" w:color="auto" w:fill="FFF7F4"/>
+          </w:tcPr>
+          <w:p>
+            <w:pPr>
+              <w:pStyle w:val="TableParagraph"/>
+              <w:rPr>
+                <w:sz w:val="18"/>
+              </w:rPr>
+            </w:pPr>
+            <w:r>
+              <w:rPr>
+                <w:sz w:val="18"/>
+              </w:rPr>
+              <w:t>ID da matricula a ser </w:t>
+            </w:r>
+            <w:r>
+              <w:rPr>
                 <w:spacing w:val="-2"/>
                 <w:sz w:val="18"/>
               </w:rPr>
@@ -1394,22 +1474,22 @@
     <w:p>
       <w:pPr>
         <w:spacing w:before="207"/>
-        <w:ind w:left="120"/>
-        <w:rPr>
-          <w:color w:val="000000" w:themeColor="text1"/>
+        <w:ind w:left="120" w:right="0" w:firstLine="0"/>
+        <w:jc w:val="left"/>
+        <w:rPr>
           <w:sz w:val="20"/>
         </w:rPr>
       </w:pPr>
       <w:r>
         <w:rPr>
-          <w:color w:val="000000" w:themeColor="text1"/>
+          <w:color w:val="878787"/>
           <w:sz w:val="20"/>
         </w:rPr>
-        <w:t xml:space="preserve">Regras de </w:t>
-      </w:r>
-      <w:r>
-        <w:rPr>
-          <w:color w:val="000000" w:themeColor="text1"/>
+        <w:t>Regras de </w:t>
+      </w:r>
+      <w:r>
+        <w:rPr>
+          <w:color w:val="878787"/>
           <w:spacing w:val="-2"/>
           <w:sz w:val="20"/>
         </w:rPr>
@@ -1418,99 +1498,117 @@
     </w:p>
     <w:p>
       <w:pPr>
-        <w:pStyle w:val="PargrafodaLista"/>
+        <w:pStyle w:val="ListParagraph"/>
         <w:numPr>
           <w:ilvl w:val="0"/>
           <w:numId w:val="1"/>
         </w:numPr>
         <w:tabs>
-          <w:tab w:val="left" w:pos="254"/>
+          <w:tab w:pos="254" w:val="left" w:leader="none"/>
         </w:tabs>
-        <w:spacing w:before="51"/>
-        <w:ind w:hanging="134"/>
+        <w:spacing w:line="240" w:lineRule="auto" w:before="51" w:after="0"/>
+        <w:ind w:left="254" w:right="0" w:hanging="134"/>
+        <w:jc w:val="left"/>
+        <w:rPr>
+          <w:sz w:val="22"/>
+        </w:rPr>
       </w:pPr>
       <w:r>
         <w:rPr>
           <w:color w:val="1A1A1A"/>
-        </w:rPr>
-        <w:t xml:space="preserve">Verifica se a matricula existe antes de </w:t>
+          <w:sz w:val="22"/>
+        </w:rPr>
+        <w:t>Verifica se a matricula existe antes de </w:t>
       </w:r>
       <w:r>
         <w:rPr>
           <w:color w:val="1A1A1A"/>
           <w:spacing w:val="-2"/>
+          <w:sz w:val="22"/>
         </w:rPr>
         <w:t>cancelar.</w:t>
       </w:r>
     </w:p>
     <w:p>
       <w:pPr>
-        <w:pStyle w:val="PargrafodaLista"/>
+        <w:pStyle w:val="ListParagraph"/>
         <w:numPr>
           <w:ilvl w:val="0"/>
           <w:numId w:val="1"/>
         </w:numPr>
         <w:tabs>
-          <w:tab w:val="left" w:pos="254"/>
+          <w:tab w:pos="254" w:val="left" w:leader="none"/>
         </w:tabs>
-        <w:ind w:hanging="134"/>
+        <w:spacing w:line="240" w:lineRule="auto" w:before="67" w:after="0"/>
+        <w:ind w:left="254" w:right="0" w:hanging="134"/>
+        <w:jc w:val="left"/>
+        <w:rPr>
+          <w:sz w:val="22"/>
+        </w:rPr>
       </w:pPr>
       <w:r>
         <w:rPr>
           <w:color w:val="1A1A1A"/>
-        </w:rPr>
-        <w:t xml:space="preserve">Atualiza o status da matricula para </w:t>
+          <w:sz w:val="22"/>
+        </w:rPr>
+        <w:t>Atualiza o status da matricula para </w:t>
       </w:r>
       <w:r>
         <w:rPr>
           <w:color w:val="1A1A1A"/>
           <w:spacing w:val="-2"/>
+          <w:sz w:val="22"/>
         </w:rPr>
         <w:t>CANCELADA.</w:t>
       </w:r>
     </w:p>
     <w:p>
       <w:pPr>
-        <w:pStyle w:val="PargrafodaLista"/>
+        <w:pStyle w:val="ListParagraph"/>
         <w:numPr>
           <w:ilvl w:val="0"/>
           <w:numId w:val="1"/>
         </w:numPr>
         <w:tabs>
-          <w:tab w:val="left" w:pos="254"/>
+          <w:tab w:pos="254" w:val="left" w:leader="none"/>
         </w:tabs>
-        <w:ind w:hanging="134"/>
+        <w:spacing w:line="240" w:lineRule="auto" w:before="67" w:after="0"/>
+        <w:ind w:left="254" w:right="0" w:hanging="134"/>
+        <w:jc w:val="left"/>
+        <w:rPr>
+          <w:sz w:val="22"/>
+        </w:rPr>
       </w:pPr>
       <w:r>
         <w:rPr>
           <w:color w:val="1A1A1A"/>
-        </w:rPr>
-        <w:t xml:space="preserve">Se o aluno nao tiver outra matricula ativa, atualiza o status dele para </w:t>
+          <w:sz w:val="22"/>
+        </w:rPr>
+        <w:t>Se o aluno nao tiver outra matricula ativa, atualiza o status dele para </w:t>
       </w:r>
       <w:r>
         <w:rPr>
           <w:color w:val="1A1A1A"/>
           <w:spacing w:val="-2"/>
+          <w:sz w:val="22"/>
         </w:rPr>
         <w:t>INATIVO.</w:t>
       </w:r>
     </w:p>
     <w:sectPr>
       <w:pgSz w:w="11910" w:h="16840"/>
-      <w:pgMar w:top="1460" w:right="1700" w:bottom="280" w:left="1417" w:header="720" w:footer="720" w:gutter="0"/>
-      <w:cols w:space="720"/>
+      <w:pgMar w:top="1460" w:bottom="280" w:left="1417" w:right="1700"/>
     </w:sectPr>
   </w:body>
 </w:document>
 </file>
 
 <file path=word/numbering.xml><?xml version="1.0" encoding="utf-8"?>
-<w:numbering xmlns:wpc="http://schemas.microsoft.com/office/word/2010/wordprocessingCanvas" xmlns:cx="http://schemas.microsoft.com/office/drawing/2014/chartex" xmlns:cx1="http://schemas.microsoft.com/office/drawing/2015/9/8/chartex" xmlns:cx2="http://schemas.microsoft.com/office/drawing/2015/10/21/chartex" xmlns:cx3="http://schemas.microsoft.com/office/drawing/2016/5/9/chartex" xmlns:cx4="http://schemas.microsoft.com/office/drawing/2016/5/10/chartex" xmlns:cx5="http://schemas.microsoft.com/office/drawing/2016/5/11/chartex" xmlns:cx6="http://schemas.microsoft.com/office/drawing/2016/5/12/chartex" xmlns:cx7="http://schemas.microsoft.com/office/drawing/2016/5/13/chartex" xmlns:cx8="http://schemas.microsoft.com/office/drawing/2016/5/14/chartex" xmlns:mc="http://schemas.openxmlformats.org/markup-compatibility/2006" xmlns:aink="http://schemas.microsoft.com/office/drawing/2016/ink" xmlns:am3d="http://schemas.microsoft.com/office/drawing/2017/model3d" xmlns:o="urn:schemas-microsoft-com:office:office" xmlns:oel="http://schemas.microsoft.com/office/2019/extlst" xmlns:r="http://schemas.openxmlformats.org/officeDocument/2006/relationships" xmlns:m="http://schemas.openxmlformats.org/officeDocument/2006/math" xmlns:v="urn:schemas-microsoft-com:vml" xmlns:wp14="http://schemas.microsoft.com/office/word/2010/wordprocessingDrawing" xmlns:wp="http://schemas.openxmlformats.org/drawingml/2006/wordprocessingDrawing" xmlns:w10="urn:schemas-microsoft-com:office:word" xmlns:w="http://schemas.openxmlformats.org/wordprocessingml/2006/main" xmlns:w14="http://schemas.microsoft.com/office/word/2010/wordml" xmlns:w15="http://schemas.microsoft.com/office/word/2012/wordml" xmlns:w16cex="http://schemas.microsoft.com/office/word/2018/wordml/cex" xmlns:w16cid="http://schemas.microsoft.com/office/word/2016/wordml/cid" xmlns:w16="http://schemas.microsoft.com/office/word/2018/wordml" xmlns:w16du="http://schemas.microsoft.com/office/word/2023/wordml/word16du" xmlns:w16sdtdh="http://schemas.microsoft.com/office/word/2020/wordml/sdtdatahash" xmlns:w16sdtfl="http://schemas.microsoft.com/office/word/2024/wordml/sdtformatlock" xmlns:w16se="http://schemas.microsoft.com/office/word/2015/wordml/symex" xmlns:wpg="http://schemas.microsoft.com/office/word/2010/wordprocessingGroup" xmlns:wpi="http://schemas.microsoft.com/office/word/2010/wordprocessingInk" xmlns:wne="http://schemas.microsoft.com/office/word/2006/wordml" xmlns:wps="http://schemas.microsoft.com/office/word/2010/wordprocessingShape" mc:Ignorable="w14 w15 w16se w16cid w16 w16cex w16sdtdh w16sdtfl w16du wp14">
-  <w:abstractNum w:abstractNumId="0" w15:restartNumberingAfterBreak="0">
-    <w:nsid w:val="233A0EC0"/>
+<w:numbering xmlns:ve="http://schemas.openxmlformats.org/markup-compatibility/2006" xmlns:o="urn:schemas-microsoft-com:office:office" xmlns:r="http://schemas.openxmlformats.org/officeDocument/2006/relationships" xmlns:m="http://schemas.openxmlformats.org/officeDocument/2006/math" xmlns:v="urn:schemas-microsoft-com:vml" xmlns:wp="http://schemas.openxmlformats.org/drawingml/2006/wordprocessingDrawing" xmlns:w10="urn:schemas-microsoft-com:office:word" xmlns:w="http://schemas.openxmlformats.org/wordprocessingml/2006/main" xmlns:wne="http://schemas.microsoft.com/office/word/2006/wordml">
+  <w:abstractNum w:abstractNumId="0">
     <w:multiLevelType w:val="hybridMultilevel"/>
-    <w:tmpl w:val="2B0CE02C"/>
-    <w:lvl w:ilvl="0" w:tplc="8DE40E66">
+    <w:lvl w:ilvl="0">
+      <w:start w:val="0"/>
       <w:numFmt w:val="bullet"/>
       <w:lvlText w:val="-"/>
       <w:lvlJc w:val="left"/>
@@ -1518,7 +1616,7 @@
         <w:ind w:left="254" w:hanging="135"/>
       </w:pPr>
       <w:rPr>
-        <w:rFonts w:ascii="Arial MT" w:eastAsia="Arial MT" w:hAnsi="Arial MT" w:cs="Arial MT" w:hint="default"/>
+        <w:rFonts w:hint="default" w:ascii="Arial MT" w:hAnsi="Arial MT" w:eastAsia="Arial MT" w:cs="Arial MT"/>
         <w:b w:val="0"/>
         <w:bCs w:val="0"/>
         <w:i w:val="0"/>
@@ -1531,7 +1629,8 @@
         <w:lang w:val="pt-PT" w:eastAsia="en-US" w:bidi="ar-SA"/>
       </w:rPr>
     </w:lvl>
-    <w:lvl w:ilvl="1" w:tplc="D752F9B8">
+    <w:lvl w:ilvl="1">
+      <w:start w:val="0"/>
       <w:numFmt w:val="bullet"/>
       <w:lvlText w:val="•"/>
       <w:lvlJc w:val="left"/>
@@ -1543,7 +1642,8 @@
         <w:lang w:val="pt-PT" w:eastAsia="en-US" w:bidi="ar-SA"/>
       </w:rPr>
     </w:lvl>
-    <w:lvl w:ilvl="2" w:tplc="CFB85836">
+    <w:lvl w:ilvl="2">
+      <w:start w:val="0"/>
       <w:numFmt w:val="bullet"/>
       <w:lvlText w:val="•"/>
       <w:lvlJc w:val="left"/>
@@ -1555,7 +1655,8 @@
         <w:lang w:val="pt-PT" w:eastAsia="en-US" w:bidi="ar-SA"/>
       </w:rPr>
     </w:lvl>
-    <w:lvl w:ilvl="3" w:tplc="7AB88790">
+    <w:lvl w:ilvl="3">
+      <w:start w:val="0"/>
       <w:numFmt w:val="bullet"/>
       <w:lvlText w:val="•"/>
       <w:lvlJc w:val="left"/>
@@ -1567,7 +1668,8 @@
         <w:lang w:val="pt-PT" w:eastAsia="en-US" w:bidi="ar-SA"/>
       </w:rPr>
     </w:lvl>
-    <w:lvl w:ilvl="4" w:tplc="06AEB034">
+    <w:lvl w:ilvl="4">
+      <w:start w:val="0"/>
       <w:numFmt w:val="bullet"/>
       <w:lvlText w:val="•"/>
       <w:lvlJc w:val="left"/>
@@ -1579,7 +1681,8 @@
         <w:lang w:val="pt-PT" w:eastAsia="en-US" w:bidi="ar-SA"/>
       </w:rPr>
     </w:lvl>
-    <w:lvl w:ilvl="5" w:tplc="6A52367C">
+    <w:lvl w:ilvl="5">
+      <w:start w:val="0"/>
       <w:numFmt w:val="bullet"/>
       <w:lvlText w:val="•"/>
       <w:lvlJc w:val="left"/>
@@ -1591,7 +1694,8 @@
         <w:lang w:val="pt-PT" w:eastAsia="en-US" w:bidi="ar-SA"/>
       </w:rPr>
     </w:lvl>
-    <w:lvl w:ilvl="6" w:tplc="AA284358">
+    <w:lvl w:ilvl="6">
+      <w:start w:val="0"/>
       <w:numFmt w:val="bullet"/>
       <w:lvlText w:val="•"/>
       <w:lvlJc w:val="left"/>
@@ -1603,7 +1707,8 @@
         <w:lang w:val="pt-PT" w:eastAsia="en-US" w:bidi="ar-SA"/>
       </w:rPr>
     </w:lvl>
-    <w:lvl w:ilvl="7" w:tplc="F6FE2B88">
+    <w:lvl w:ilvl="7">
+      <w:start w:val="0"/>
       <w:numFmt w:val="bullet"/>
       <w:lvlText w:val="•"/>
       <w:lvlJc w:val="left"/>
@@ -1615,7 +1720,8 @@
         <w:lang w:val="pt-PT" w:eastAsia="en-US" w:bidi="ar-SA"/>
       </w:rPr>
     </w:lvl>
-    <w:lvl w:ilvl="8" w:tplc="69C4DFF8">
+    <w:lvl w:ilvl="8">
+      <w:start w:val="0"/>
       <w:numFmt w:val="bullet"/>
       <w:lvlText w:val="•"/>
       <w:lvlJc w:val="left"/>
@@ -1628,21 +1734,21 @@
       </w:rPr>
     </w:lvl>
   </w:abstractNum>
-  <w:num w:numId="1" w16cid:durableId="1598978298">
+  <w:num w:numId="1">
     <w:abstractNumId w:val="0"/>
   </w:num>
 </w:numbering>
 </file>
 
 <file path=word/styles.xml><?xml version="1.0" encoding="utf-8"?>
-<w:styles xmlns:mc="http://schemas.openxmlformats.org/markup-compatibility/2006" xmlns:r="http://schemas.openxmlformats.org/officeDocument/2006/relationships" xmlns:w="http://schemas.openxmlformats.org/wordprocessingml/2006/main" xmlns:w14="http://schemas.microsoft.com/office/word/2010/wordml" xmlns:w15="http://schemas.microsoft.com/office/word/2012/wordml" xmlns:w16cex="http://schemas.microsoft.com/office/word/2018/wordml/cex" xmlns:w16cid="http://schemas.microsoft.com/office/word/2016/wordml/cid" xmlns:w16="http://schemas.microsoft.com/office/word/2018/wordml" xmlns:w16du="http://schemas.microsoft.com/office/word/2023/wordml/word16du" xmlns:w16sdtdh="http://schemas.microsoft.com/office/word/2020/wordml/sdtdatahash" xmlns:w16sdtfl="http://schemas.microsoft.com/office/word/2024/wordml/sdtformatlock" xmlns:w16se="http://schemas.microsoft.com/office/word/2015/wordml/symex" mc:Ignorable="w14 w15 w16se w16cid w16 w16cex w16sdtdh w16sdtfl w16du">
+<w:styles xmlns:r="http://schemas.openxmlformats.org/officeDocument/2006/relationships" xmlns:w="http://schemas.openxmlformats.org/wordprocessingml/2006/main">
   <w:docDefaults>
     <w:rPrDefault>
       <w:rPr>
-        <w:rFonts w:asciiTheme="minorHAnsi" w:eastAsiaTheme="minorHAnsi" w:hAnsiTheme="minorHAnsi" w:cstheme="minorBidi"/>
+        <w:rFonts w:cstheme="minorBidi" w:hAnsiTheme="minorHAnsi" w:eastAsiaTheme="minorHAnsi" w:asciiTheme="minorHAnsi"/>
         <w:sz w:val="22"/>
         <w:szCs w:val="22"/>
-        <w:lang w:val="en-US" w:eastAsia="en-US" w:bidi="ar-SA"/>
+        <w:lang w:val="en-US" w:bidi="ar-SA" w:eastAsia="en-US"/>
       </w:rPr>
     </w:rPrDefault>
     <w:pPrDefault>
@@ -1650,441 +1756,19 @@
         <w:widowControl w:val="0"/>
         <w:autoSpaceDE w:val="0"/>
         <w:autoSpaceDN w:val="0"/>
+        <w:spacing w:lineRule="auto" w:line="240" w:before="0" w:after="0"/>
+        <w:ind w:left="0" w:right="0"/>
+        <w:jc w:val="left"/>
       </w:pPr>
     </w:pPrDefault>
   </w:docDefaults>
-  <w:latentStyles w:defLockedState="0" w:defUIPriority="99" w:defSemiHidden="0" w:defUnhideWhenUsed="0" w:defQFormat="0" w:count="376">
-    <w:lsdException w:name="Normal" w:uiPriority="0" w:qFormat="1"/>
-    <w:lsdException w:name="heading 1" w:uiPriority="9" w:qFormat="1"/>
-    <w:lsdException w:name="heading 2" w:semiHidden="1" w:uiPriority="9" w:unhideWhenUsed="1" w:qFormat="1"/>
-    <w:lsdException w:name="heading 3" w:semiHidden="1" w:uiPriority="9" w:unhideWhenUsed="1" w:qFormat="1"/>
-    <w:lsdException w:name="heading 4" w:semiHidden="1" w:uiPriority="9" w:unhideWhenUsed="1" w:qFormat="1"/>
-    <w:lsdException w:name="heading 5" w:semiHidden="1" w:uiPriority="9" w:unhideWhenUsed="1" w:qFormat="1"/>
-    <w:lsdException w:name="heading 6" w:semiHidden="1" w:uiPriority="9" w:unhideWhenUsed="1" w:qFormat="1"/>
-    <w:lsdException w:name="heading 7" w:semiHidden="1" w:uiPriority="9" w:unhideWhenUsed="1" w:qFormat="1"/>
-    <w:lsdException w:name="heading 8" w:semiHidden="1" w:uiPriority="9" w:unhideWhenUsed="1" w:qFormat="1"/>
-    <w:lsdException w:name="heading 9" w:semiHidden="1" w:uiPriority="9" w:unhideWhenUsed="1" w:qFormat="1"/>
-    <w:lsdException w:name="index 1" w:semiHidden="1" w:unhideWhenUsed="1"/>
-    <w:lsdException w:name="index 2" w:semiHidden="1" w:unhideWhenUsed="1"/>
-    <w:lsdException w:name="index 3" w:semiHidden="1" w:unhideWhenUsed="1"/>
-    <w:lsdException w:name="index 4" w:semiHidden="1" w:unhideWhenUsed="1"/>
-    <w:lsdException w:name="index 5" w:semiHidden="1" w:unhideWhenUsed="1"/>
-    <w:lsdException w:name="index 6" w:semiHidden="1" w:unhideWhenUsed="1"/>
-    <w:lsdException w:name="index 7" w:semiHidden="1" w:unhideWhenUsed="1"/>
-    <w:lsdException w:name="index 8" w:semiHidden="1" w:unhideWhenUsed="1"/>
-    <w:lsdException w:name="index 9" w:semiHidden="1" w:unhideWhenUsed="1"/>
-    <w:lsdException w:name="toc 1" w:semiHidden="1" w:uiPriority="39" w:unhideWhenUsed="1"/>
-    <w:lsdException w:name="toc 2" w:semiHidden="1" w:uiPriority="39" w:unhideWhenUsed="1"/>
-    <w:lsdException w:name="toc 3" w:semiHidden="1" w:uiPriority="39" w:unhideWhenUsed="1"/>
-    <w:lsdException w:name="toc 4" w:semiHidden="1" w:uiPriority="39" w:unhideWhenUsed="1"/>
-    <w:lsdException w:name="toc 5" w:semiHidden="1" w:uiPriority="39" w:unhideWhenUsed="1"/>
-    <w:lsdException w:name="toc 6" w:semiHidden="1" w:uiPriority="39" w:unhideWhenUsed="1"/>
-    <w:lsdException w:name="toc 7" w:semiHidden="1" w:uiPriority="39" w:unhideWhenUsed="1"/>
-    <w:lsdException w:name="toc 8" w:semiHidden="1" w:uiPriority="39" w:unhideWhenUsed="1"/>
-    <w:lsdException w:name="toc 9" w:semiHidden="1" w:uiPriority="39" w:unhideWhenUsed="1"/>
-    <w:lsdException w:name="Normal Indent" w:semiHidden="1" w:unhideWhenUsed="1"/>
-    <w:lsdException w:name="footnote text" w:semiHidden="1" w:unhideWhenUsed="1"/>
-    <w:lsdException w:name="annotation text" w:semiHidden="1" w:unhideWhenUsed="1"/>
-    <w:lsdException w:name="header" w:semiHidden="1" w:unhideWhenUsed="1"/>
-    <w:lsdException w:name="footer" w:semiHidden="1" w:unhideWhenUsed="1"/>
-    <w:lsdException w:name="index heading" w:semiHidden="1" w:unhideWhenUsed="1"/>
-    <w:lsdException w:name="caption" w:semiHidden="1" w:uiPriority="35" w:unhideWhenUsed="1" w:qFormat="1"/>
-    <w:lsdException w:name="table of figures" w:semiHidden="1" w:unhideWhenUsed="1"/>
-    <w:lsdException w:name="envelope address" w:semiHidden="1" w:unhideWhenUsed="1"/>
-    <w:lsdException w:name="envelope return" w:semiHidden="1" w:unhideWhenUsed="1"/>
-    <w:lsdException w:name="footnote reference" w:semiHidden="1" w:unhideWhenUsed="1"/>
-    <w:lsdException w:name="annotation reference" w:semiHidden="1" w:unhideWhenUsed="1"/>
-    <w:lsdException w:name="line number" w:semiHidden="1" w:unhideWhenUsed="1"/>
-    <w:lsdException w:name="page number" w:semiHidden="1" w:unhideWhenUsed="1"/>
-    <w:lsdException w:name="endnote reference" w:semiHidden="1" w:unhideWhenUsed="1"/>
-    <w:lsdException w:name="endnote text" w:semiHidden="1" w:unhideWhenUsed="1"/>
-    <w:lsdException w:name="table of authorities" w:semiHidden="1" w:unhideWhenUsed="1"/>
-    <w:lsdException w:name="macro" w:semiHidden="1" w:unhideWhenUsed="1"/>
-    <w:lsdException w:name="toa heading" w:semiHidden="1" w:unhideWhenUsed="1"/>
-    <w:lsdException w:name="List" w:semiHidden="1" w:unhideWhenUsed="1"/>
-    <w:lsdException w:name="List Bullet" w:semiHidden="1" w:unhideWhenUsed="1"/>
-    <w:lsdException w:name="List Number" w:semiHidden="1" w:unhideWhenUsed="1"/>
-    <w:lsdException w:name="List 2" w:semiHidden="1" w:unhideWhenUsed="1"/>
-    <w:lsdException w:name="List 3" w:semiHidden="1" w:unhideWhenUsed="1"/>
-    <w:lsdException w:name="List 4" w:semiHidden="1" w:unhideWhenUsed="1"/>
-    <w:lsdException w:name="List 5" w:semiHidden="1" w:unhideWhenUsed="1"/>
-    <w:lsdException w:name="List Bullet 2" w:semiHidden="1" w:unhideWhenUsed="1"/>
-    <w:lsdException w:name="List Bullet 3" w:semiHidden="1" w:unhideWhenUsed="1"/>
-    <w:lsdException w:name="List Bullet 4" w:semiHidden="1" w:unhideWhenUsed="1"/>
-    <w:lsdException w:name="List Bullet 5" w:semiHidden="1" w:unhideWhenUsed="1"/>
-    <w:lsdException w:name="List Number 2" w:semiHidden="1" w:unhideWhenUsed="1"/>
-    <w:lsdException w:name="List Number 3" w:semiHidden="1" w:unhideWhenUsed="1"/>
-    <w:lsdException w:name="List Number 4" w:semiHidden="1" w:unhideWhenUsed="1"/>
-    <w:lsdException w:name="List Number 5" w:semiHidden="1" w:unhideWhenUsed="1"/>
-    <w:lsdException w:name="Title" w:uiPriority="10" w:qFormat="1"/>
-    <w:lsdException w:name="Closing" w:semiHidden="1" w:unhideWhenUsed="1"/>
-    <w:lsdException w:name="Signature" w:semiHidden="1" w:unhideWhenUsed="1"/>
-    <w:lsdException w:name="Default Paragraph Font" w:semiHidden="1" w:uiPriority="1" w:unhideWhenUsed="1"/>
-    <w:lsdException w:name="Body Text" w:semiHidden="1" w:unhideWhenUsed="1"/>
-    <w:lsdException w:name="Body Text Indent" w:semiHidden="1" w:unhideWhenUsed="1"/>
-    <w:lsdException w:name="List Continue" w:semiHidden="1" w:unhideWhenUsed="1"/>
-    <w:lsdException w:name="List Continue 2" w:semiHidden="1" w:unhideWhenUsed="1"/>
-    <w:lsdException w:name="List Continue 3" w:semiHidden="1" w:unhideWhenUsed="1"/>
-    <w:lsdException w:name="List Continue 4" w:semiHidden="1" w:unhideWhenUsed="1"/>
-    <w:lsdException w:name="List Continue 5" w:semiHidden="1" w:unhideWhenUsed="1"/>
-    <w:lsdException w:name="Message Header" w:semiHidden="1" w:unhideWhenUsed="1"/>
-    <w:lsdException w:name="Subtitle" w:uiPriority="11" w:qFormat="1"/>
-    <w:lsdException w:name="Salutation" w:semiHidden="1" w:unhideWhenUsed="1"/>
-    <w:lsdException w:name="Date" w:semiHidden="1" w:unhideWhenUsed="1"/>
-    <w:lsdException w:name="Body Text First Indent" w:semiHidden="1" w:unhideWhenUsed="1"/>
-    <w:lsdException w:name="Body Text First Indent 2" w:semiHidden="1" w:unhideWhenUsed="1"/>
-    <w:lsdException w:name="Note Heading" w:semiHidden="1" w:unhideWhenUsed="1"/>
-    <w:lsdException w:name="Body Text 2" w:semiHidden="1" w:unhideWhenUsed="1"/>
-    <w:lsdException w:name="Body Text 3" w:semiHidden="1" w:unhideWhenUsed="1"/>
-    <w:lsdException w:name="Body Text Indent 2" w:semiHidden="1" w:unhideWhenUsed="1"/>
-    <w:lsdException w:name="Body Text Indent 3" w:semiHidden="1" w:unhideWhenUsed="1"/>
-    <w:lsdException w:name="Block Text" w:semiHidden="1" w:unhideWhenUsed="1"/>
-    <w:lsdException w:name="Hyperlink" w:semiHidden="1" w:unhideWhenUsed="1"/>
-    <w:lsdException w:name="FollowedHyperlink" w:semiHidden="1" w:unhideWhenUsed="1"/>
-    <w:lsdException w:name="Strong" w:uiPriority="22" w:qFormat="1"/>
-    <w:lsdException w:name="Emphasis" w:uiPriority="20" w:qFormat="1"/>
-    <w:lsdException w:name="Document Map" w:semiHidden="1" w:unhideWhenUsed="1"/>
-    <w:lsdException w:name="Plain Text" w:semiHidden="1" w:unhideWhenUsed="1"/>
-    <w:lsdException w:name="E-mail Signature" w:semiHidden="1" w:unhideWhenUsed="1"/>
-    <w:lsdException w:name="HTML Top of Form" w:semiHidden="1" w:unhideWhenUsed="1"/>
-    <w:lsdException w:name="HTML Bottom of Form" w:semiHidden="1" w:unhideWhenUsed="1"/>
-    <w:lsdException w:name="Normal (Web)" w:semiHidden="1" w:unhideWhenUsed="1"/>
-    <w:lsdException w:name="HTML Acronym" w:semiHidden="1" w:unhideWhenUsed="1"/>
-    <w:lsdException w:name="HTML Address" w:semiHidden="1" w:unhideWhenUsed="1"/>
-    <w:lsdException w:name="HTML Cite" w:semiHidden="1" w:unhideWhenUsed="1"/>
-    <w:lsdException w:name="HTML Code" w:semiHidden="1" w:unhideWhenUsed="1"/>
-    <w:lsdException w:name="HTML Definition" w:semiHidden="1" w:unhideWhenUsed="1"/>
-    <w:lsdException w:name="HTML Keyboard" w:semiHidden="1" w:unhideWhenUsed="1"/>
-    <w:lsdException w:name="HTML Preformatted" w:semiHidden="1" w:unhideWhenUsed="1"/>
-    <w:lsdException w:name="HTML Sample" w:semiHidden="1" w:unhideWhenUsed="1"/>
-    <w:lsdException w:name="HTML Typewriter" w:semiHidden="1" w:unhideWhenUsed="1"/>
-    <w:lsdException w:name="HTML Variable" w:semiHidden="1" w:unhideWhenUsed="1"/>
-    <w:lsdException w:name="Normal Table" w:semiHidden="1" w:unhideWhenUsed="1"/>
-    <w:lsdException w:name="annotation subject" w:semiHidden="1" w:unhideWhenUsed="1"/>
-    <w:lsdException w:name="No List" w:semiHidden="1" w:unhideWhenUsed="1"/>
-    <w:lsdException w:name="Outline List 1" w:semiHidden="1" w:unhideWhenUsed="1"/>
-    <w:lsdException w:name="Outline List 2" w:semiHidden="1" w:unhideWhenUsed="1"/>
-    <w:lsdException w:name="Outline List 3" w:semiHidden="1" w:unhideWhenUsed="1"/>
-    <w:lsdException w:name="Table Simple 1" w:semiHidden="1" w:unhideWhenUsed="1"/>
-    <w:lsdException w:name="Table Simple 2" w:semiHidden="1" w:unhideWhenUsed="1"/>
-    <w:lsdException w:name="Table Simple 3" w:semiHidden="1" w:unhideWhenUsed="1"/>
-    <w:lsdException w:name="Table Classic 1" w:semiHidden="1" w:unhideWhenUsed="1"/>
-    <w:lsdException w:name="Table Classic 2" w:semiHidden="1" w:unhideWhenUsed="1"/>
-    <w:lsdException w:name="Table Classic 3" w:semiHidden="1" w:unhideWhenUsed="1"/>
-    <w:lsdException w:name="Table Classic 4" w:semiHidden="1" w:unhideWhenUsed="1"/>
-    <w:lsdException w:name="Table Colorful 1" w:semiHidden="1" w:unhideWhenUsed="1"/>
-    <w:lsdException w:name="Table Colorful 2" w:semiHidden="1" w:unhideWhenUsed="1"/>
-    <w:lsdException w:name="Table Colorful 3" w:semiHidden="1" w:unhideWhenUsed="1"/>
-    <w:lsdException w:name="Table Columns 1" w:semiHidden="1" w:unhideWhenUsed="1"/>
-    <w:lsdException w:name="Table Columns 2" w:semiHidden="1" w:unhideWhenUsed="1"/>
-    <w:lsdException w:name="Table Columns 3" w:semiHidden="1" w:unhideWhenUsed="1"/>
-    <w:lsdException w:name="Table Columns 4" w:semiHidden="1" w:unhideWhenUsed="1"/>
-    <w:lsdException w:name="Table Columns 5" w:semiHidden="1" w:unhideWhenUsed="1"/>
-    <w:lsdException w:name="Table Grid 1" w:semiHidden="1" w:unhideWhenUsed="1"/>
-    <w:lsdException w:name="Table Grid 2" w:semiHidden="1" w:unhideWhenUsed="1"/>
-    <w:lsdException w:name="Table Grid 3" w:semiHidden="1" w:unhideWhenUsed="1"/>
-    <w:lsdException w:name="Table Grid 4" w:semiHidden="1" w:unhideWhenUsed="1"/>
-    <w:lsdException w:name="Table Grid 5" w:semiHidden="1" w:unhideWhenUsed="1"/>
-    <w:lsdException w:name="Table Grid 6" w:semiHidden="1" w:unhideWhenUsed="1"/>
-    <w:lsdException w:name="Table Grid 7" w:semiHidden="1" w:unhideWhenUsed="1"/>
-    <w:lsdException w:name="Table Grid 8" w:semiHidden="1" w:unhideWhenUsed="1"/>
-    <w:lsdException w:name="Table List 1" w:semiHidden="1" w:unhideWhenUsed="1"/>
-    <w:lsdException w:name="Table List 2" w:semiHidden="1" w:unhideWhenUsed="1"/>
-    <w:lsdException w:name="Table List 3" w:semiHidden="1" w:unhideWhenUsed="1"/>
-    <w:lsdException w:name="Table List 4" w:semiHidden="1" w:unhideWhenUsed="1"/>
-    <w:lsdException w:name="Table List 5" w:semiHidden="1" w:unhideWhenUsed="1"/>
-    <w:lsdException w:name="Table List 6" w:semiHidden="1" w:unhideWhenUsed="1"/>
-    <w:lsdException w:name="Table List 7" w:semiHidden="1" w:unhideWhenUsed="1"/>
-    <w:lsdException w:name="Table List 8" w:semiHidden="1" w:unhideWhenUsed="1"/>
-    <w:lsdException w:name="Table 3D effects 1" w:semiHidden="1" w:unhideWhenUsed="1"/>
-    <w:lsdException w:name="Table 3D effects 2" w:semiHidden="1" w:unhideWhenUsed="1"/>
-    <w:lsdException w:name="Table 3D effects 3" w:semiHidden="1" w:unhideWhenUsed="1"/>
-    <w:lsdException w:name="Table Contemporary" w:semiHidden="1" w:unhideWhenUsed="1"/>
-    <w:lsdException w:name="Table Elegant" w:semiHidden="1" w:unhideWhenUsed="1"/>
-    <w:lsdException w:name="Table Professional" w:semiHidden="1" w:unhideWhenUsed="1"/>
-    <w:lsdException w:name="Table Subtle 1" w:semiHidden="1" w:unhideWhenUsed="1"/>
-    <w:lsdException w:name="Table Subtle 2" w:semiHidden="1" w:unhideWhenUsed="1"/>
-    <w:lsdException w:name="Table Web 1" w:semiHidden="1" w:unhideWhenUsed="1"/>
-    <w:lsdException w:name="Table Web 2" w:semiHidden="1" w:unhideWhenUsed="1"/>
-    <w:lsdException w:name="Table Web 3" w:semiHidden="1" w:unhideWhenUsed="1"/>
-    <w:lsdException w:name="Balloon Text" w:semiHidden="1" w:unhideWhenUsed="1"/>
-    <w:lsdException w:name="Table Grid" w:uiPriority="39"/>
-    <w:lsdException w:name="Table Theme" w:semiHidden="1" w:unhideWhenUsed="1"/>
-    <w:lsdException w:name="Placeholder Text" w:semiHidden="1"/>
-    <w:lsdException w:name="No Spacing" w:uiPriority="1" w:qFormat="1"/>
-    <w:lsdException w:name="Light Shading" w:uiPriority="60"/>
-    <w:lsdException w:name="Light List" w:uiPriority="61"/>
-    <w:lsdException w:name="Light Grid" w:uiPriority="62"/>
-    <w:lsdException w:name="Medium Shading 1" w:uiPriority="63"/>
-    <w:lsdException w:name="Medium Shading 2" w:uiPriority="64"/>
-    <w:lsdException w:name="Medium List 1" w:uiPriority="65"/>
-    <w:lsdException w:name="Medium List 2" w:uiPriority="66"/>
-    <w:lsdException w:name="Medium Grid 1" w:uiPriority="67"/>
-    <w:lsdException w:name="Medium Grid 2" w:uiPriority="68"/>
-    <w:lsdException w:name="Medium Grid 3" w:uiPriority="69"/>
-    <w:lsdException w:name="Dark List" w:uiPriority="70"/>
-    <w:lsdException w:name="Colorful Shading" w:uiPriority="71"/>
-    <w:lsdException w:name="Colorful List" w:uiPriority="72"/>
-    <w:lsdException w:name="Colorful Grid" w:uiPriority="73"/>
-    <w:lsdException w:name="Light Shading Accent 1" w:uiPriority="60"/>
-    <w:lsdException w:name="Light List Accent 1" w:uiPriority="61"/>
-    <w:lsdException w:name="Light Grid Accent 1" w:uiPriority="62"/>
-    <w:lsdException w:name="Medium Shading 1 Accent 1" w:uiPriority="63"/>
-    <w:lsdException w:name="Medium Shading 2 Accent 1" w:uiPriority="64"/>
-    <w:lsdException w:name="Medium List 1 Accent 1" w:uiPriority="65"/>
-    <w:lsdException w:name="Revision" w:semiHidden="1"/>
-    <w:lsdException w:name="List Paragraph" w:uiPriority="34" w:qFormat="1"/>
-    <w:lsdException w:name="Quote" w:uiPriority="29" w:qFormat="1"/>
-    <w:lsdException w:name="Intense Quote" w:uiPriority="30" w:qFormat="1"/>
-    <w:lsdException w:name="Medium List 2 Accent 1" w:uiPriority="66"/>
-    <w:lsdException w:name="Medium Grid 1 Accent 1" w:uiPriority="67"/>
-    <w:lsdException w:name="Medium Grid 2 Accent 1" w:uiPriority="68"/>
-    <w:lsdException w:name="Medium Grid 3 Accent 1" w:uiPriority="69"/>
-    <w:lsdException w:name="Dark List Accent 1" w:uiPriority="70"/>
-    <w:lsdException w:name="Colorful Shading Accent 1" w:uiPriority="71"/>
-    <w:lsdException w:name="Colorful List Accent 1" w:uiPriority="72"/>
-    <w:lsdException w:name="Colorful Grid Accent 1" w:uiPriority="73"/>
-    <w:lsdException w:name="Light Shading Accent 2" w:uiPriority="60"/>
-    <w:lsdException w:name="Light List Accent 2" w:uiPriority="61"/>
-    <w:lsdException w:name="Light Grid Accent 2" w:uiPriority="62"/>
-    <w:lsdException w:name="Medium Shading 1 Accent 2" w:uiPriority="63"/>
-    <w:lsdException w:name="Medium Shading 2 Accent 2" w:uiPriority="64"/>
-    <w:lsdException w:name="Medium List 1 Accent 2" w:uiPriority="65"/>
-    <w:lsdException w:name="Medium List 2 Accent 2" w:uiPriority="66"/>
-    <w:lsdException w:name="Medium Grid 1 Accent 2" w:uiPriority="67"/>
-    <w:lsdException w:name="Medium Grid 2 Accent 2" w:uiPriority="68"/>
-    <w:lsdException w:name="Medium Grid 3 Accent 2" w:uiPriority="69"/>
-    <w:lsdException w:name="Dark List Accent 2" w:uiPriority="70"/>
-    <w:lsdException w:name="Colorful Shading Accent 2" w:uiPriority="71"/>
-    <w:lsdException w:name="Colorful List Accent 2" w:uiPriority="72"/>
-    <w:lsdException w:name="Colorful Grid Accent 2" w:uiPriority="73"/>
-    <w:lsdException w:name="Light Shading Accent 3" w:uiPriority="60"/>
-    <w:lsdException w:name="Light List Accent 3" w:uiPriority="61"/>
-    <w:lsdException w:name="Light Grid Accent 3" w:uiPriority="62"/>
-    <w:lsdException w:name="Medium Shading 1 Accent 3" w:uiPriority="63"/>
-    <w:lsdException w:name="Medium Shading 2 Accent 3" w:uiPriority="64"/>
-    <w:lsdException w:name="Medium List 1 Accent 3" w:uiPriority="65"/>
-    <w:lsdException w:name="Medium List 2 Accent 3" w:uiPriority="66"/>
-    <w:lsdException w:name="Medium Grid 1 Accent 3" w:uiPriority="67"/>
-    <w:lsdException w:name="Medium Grid 2 Accent 3" w:uiPriority="68"/>
-    <w:lsdException w:name="Medium Grid 3 Accent 3" w:uiPriority="69"/>
-    <w:lsdException w:name="Dark List Accent 3" w:uiPriority="70"/>
-    <w:lsdException w:name="Colorful Shading Accent 3" w:uiPriority="71"/>
-    <w:lsdException w:name="Colorful List Accent 3" w:uiPriority="72"/>
-    <w:lsdException w:name="Colorful Grid Accent 3" w:uiPriority="73"/>
-    <w:lsdException w:name="Light Shading Accent 4" w:uiPriority="60"/>
-    <w:lsdException w:name="Light List Accent 4" w:uiPriority="61"/>
-    <w:lsdException w:name="Light Grid Accent 4" w:uiPriority="62"/>
-    <w:lsdException w:name="Medium Shading 1 Accent 4" w:uiPriority="63"/>
-    <w:lsdException w:name="Medium Shading 2 Accent 4" w:uiPriority="64"/>
-    <w:lsdException w:name="Medium List 1 Accent 4" w:uiPriority="65"/>
-    <w:lsdException w:name="Medium List 2 Accent 4" w:uiPriority="66"/>
-    <w:lsdException w:name="Medium Grid 1 Accent 4" w:uiPriority="67"/>
-    <w:lsdException w:name="Medium Grid 2 Accent 4" w:uiPriority="68"/>
-    <w:lsdException w:name="Medium Grid 3 Accent 4" w:uiPriority="69"/>
-    <w:lsdException w:name="Dark List Accent 4" w:uiPriority="70"/>
-    <w:lsdException w:name="Colorful Shading Accent 4" w:uiPriority="71"/>
-    <w:lsdException w:name="Colorful List Accent 4" w:uiPriority="72"/>
-    <w:lsdException w:name="Colorful Grid Accent 4" w:uiPriority="73"/>
-    <w:lsdException w:name="Light Shading Accent 5" w:uiPriority="60"/>
-    <w:lsdException w:name="Light List Accent 5" w:uiPriority="61"/>
-    <w:lsdException w:name="Light Grid Accent 5" w:uiPriority="62"/>
-    <w:lsdException w:name="Medium Shading 1 Accent 5" w:uiPriority="63"/>
-    <w:lsdException w:name="Medium Shading 2 Accent 5" w:uiPriority="64"/>
-    <w:lsdException w:name="Medium List 1 Accent 5" w:uiPriority="65"/>
-    <w:lsdException w:name="Medium List 2 Accent 5" w:uiPriority="66"/>
-    <w:lsdException w:name="Medium Grid 1 Accent 5" w:uiPriority="67"/>
-    <w:lsdException w:name="Medium Grid 2 Accent 5" w:uiPriority="68"/>
-    <w:lsdException w:name="Medium Grid 3 Accent 5" w:uiPriority="69"/>
-    <w:lsdException w:name="Dark List Accent 5" w:uiPriority="70"/>
-    <w:lsdException w:name="Colorful Shading Accent 5" w:uiPriority="71"/>
-    <w:lsdException w:name="Colorful List Accent 5" w:uiPriority="72"/>
-    <w:lsdException w:name="Colorful Grid Accent 5" w:uiPriority="73"/>
-    <w:lsdException w:name="Light Shading Accent 6" w:uiPriority="60"/>
-    <w:lsdException w:name="Light List Accent 6" w:uiPriority="61"/>
-    <w:lsdException w:name="Light Grid Accent 6" w:uiPriority="62"/>
-    <w:lsdException w:name="Medium Shading 1 Accent 6" w:uiPriority="63"/>
-    <w:lsdException w:name="Medium Shading 2 Accent 6" w:uiPriority="64"/>
-    <w:lsdException w:name="Medium List 1 Accent 6" w:uiPriority="65"/>
-    <w:lsdException w:name="Medium List 2 Accent 6" w:uiPriority="66"/>
-    <w:lsdException w:name="Medium Grid 1 Accent 6" w:uiPriority="67"/>
-    <w:lsdException w:name="Medium Grid 2 Accent 6" w:uiPriority="68"/>
-    <w:lsdException w:name="Medium Grid 3 Accent 6" w:uiPriority="69"/>
-    <w:lsdException w:name="Dark List Accent 6" w:uiPriority="70"/>
-    <w:lsdException w:name="Colorful Shading Accent 6" w:uiPriority="71"/>
-    <w:lsdException w:name="Colorful List Accent 6" w:uiPriority="72"/>
-    <w:lsdException w:name="Colorful Grid Accent 6" w:uiPriority="73"/>
-    <w:lsdException w:name="Subtle Emphasis" w:uiPriority="19" w:qFormat="1"/>
-    <w:lsdException w:name="Intense Emphasis" w:uiPriority="21" w:qFormat="1"/>
-    <w:lsdException w:name="Subtle Reference" w:uiPriority="31" w:qFormat="1"/>
-    <w:lsdException w:name="Intense Reference" w:uiPriority="32" w:qFormat="1"/>
-    <w:lsdException w:name="Book Title" w:uiPriority="33" w:qFormat="1"/>
-    <w:lsdException w:name="Bibliography" w:semiHidden="1" w:uiPriority="37" w:unhideWhenUsed="1"/>
-    <w:lsdException w:name="TOC Heading" w:semiHidden="1" w:uiPriority="39" w:unhideWhenUsed="1" w:qFormat="1"/>
-    <w:lsdException w:name="Plain Table 1" w:uiPriority="41"/>
-    <w:lsdException w:name="Plain Table 2" w:uiPriority="42"/>
-    <w:lsdException w:name="Plain Table 3" w:uiPriority="43"/>
-    <w:lsdException w:name="Plain Table 4" w:uiPriority="44"/>
-    <w:lsdException w:name="Plain Table 5" w:uiPriority="45"/>
-    <w:lsdException w:name="Grid Table Light" w:uiPriority="40"/>
-    <w:lsdException w:name="Grid Table 1 Light" w:uiPriority="46"/>
-    <w:lsdException w:name="Grid Table 2" w:uiPriority="47"/>
-    <w:lsdException w:name="Grid Table 3" w:uiPriority="48"/>
-    <w:lsdException w:name="Grid Table 4" w:uiPriority="49"/>
-    <w:lsdException w:name="Grid Table 5 Dark" w:uiPriority="50"/>
-    <w:lsdException w:name="Grid Table 6 Colorful" w:uiPriority="51"/>
-    <w:lsdException w:name="Grid Table 7 Colorful" w:uiPriority="52"/>
-    <w:lsdException w:name="Grid Table 1 Light Accent 1" w:uiPriority="46"/>
-    <w:lsdException w:name="Grid Table 2 Accent 1" w:uiPriority="47"/>
-    <w:lsdException w:name="Grid Table 3 Accent 1" w:uiPriority="48"/>
-    <w:lsdException w:name="Grid Table 4 Accent 1" w:uiPriority="49"/>
-    <w:lsdException w:name="Grid Table 5 Dark Accent 1" w:uiPriority="50"/>
-    <w:lsdException w:name="Grid Table 6 Colorful Accent 1" w:uiPriority="51"/>
-    <w:lsdException w:name="Grid Table 7 Colorful Accent 1" w:uiPriority="52"/>
-    <w:lsdException w:name="Grid Table 1 Light Accent 2" w:uiPriority="46"/>
-    <w:lsdException w:name="Grid Table 2 Accent 2" w:uiPriority="47"/>
-    <w:lsdException w:name="Grid Table 3 Accent 2" w:uiPriority="48"/>
-    <w:lsdException w:name="Grid Table 4 Accent 2" w:uiPriority="49"/>
-    <w:lsdException w:name="Grid Table 5 Dark Accent 2" w:uiPriority="50"/>
-    <w:lsdException w:name="Grid Table 6 Colorful Accent 2" w:uiPriority="51"/>
-    <w:lsdException w:name="Grid Table 7 Colorful Accent 2" w:uiPriority="52"/>
-    <w:lsdException w:name="Grid Table 1 Light Accent 3" w:uiPriority="46"/>
-    <w:lsdException w:name="Grid Table 2 Accent 3" w:uiPriority="47"/>
-    <w:lsdException w:name="Grid Table 3 Accent 3" w:uiPriority="48"/>
-    <w:lsdException w:name="Grid Table 4 Accent 3" w:uiPriority="49"/>
-    <w:lsdException w:name="Grid Table 5 Dark Accent 3" w:uiPriority="50"/>
-    <w:lsdException w:name="Grid Table 6 Colorful Accent 3" w:uiPriority="51"/>
-    <w:lsdException w:name="Grid Table 7 Colorful Accent 3" w:uiPriority="52"/>
-    <w:lsdException w:name="Grid Table 1 Light Accent 4" w:uiPriority="46"/>
-    <w:lsdException w:name="Grid Table 2 Accent 4" w:uiPriority="47"/>
-    <w:lsdException w:name="Grid Table 3 Accent 4" w:uiPriority="48"/>
-    <w:lsdException w:name="Grid Table 4 Accent 4" w:uiPriority="49"/>
-    <w:lsdException w:name="Grid Table 5 Dark Accent 4" w:uiPriority="50"/>
-    <w:lsdException w:name="Grid Table 6 Colorful Accent 4" w:uiPriority="51"/>
-    <w:lsdException w:name="Grid Table 7 Colorful Accent 4" w:uiPriority="52"/>
-    <w:lsdException w:name="Grid Table 1 Light Accent 5" w:uiPriority="46"/>
-    <w:lsdException w:name="Grid Table 2 Accent 5" w:uiPriority="47"/>
-    <w:lsdException w:name="Grid Table 3 Accent 5" w:uiPriority="48"/>
-    <w:lsdException w:name="Grid Table 4 Accent 5" w:uiPriority="49"/>
-    <w:lsdException w:name="Grid Table 5 Dark Accent 5" w:uiPriority="50"/>
-    <w:lsdException w:name="Grid Table 6 Colorful Accent 5" w:uiPriority="51"/>
-    <w:lsdException w:name="Grid Table 7 Colorful Accent 5" w:uiPriority="52"/>
-    <w:lsdException w:name="Grid Table 1 Light Accent 6" w:uiPriority="46"/>
-    <w:lsdException w:name="Grid Table 2 Accent 6" w:uiPriority="47"/>
-    <w:lsdException w:name="Grid Table 3 Accent 6" w:uiPriority="48"/>
-    <w:lsdException w:name="Grid Table 4 Accent 6" w:uiPriority="49"/>
-    <w:lsdException w:name="Grid Table 5 Dark Accent 6" w:uiPriority="50"/>
-    <w:lsdException w:name="Grid Table 6 Colorful Accent 6" w:uiPriority="51"/>
-    <w:lsdException w:name="Grid Table 7 Colorful Accent 6" w:uiPriority="52"/>
-    <w:lsdException w:name="List Table 1 Light" w:uiPriority="46"/>
-    <w:lsdException w:name="List Table 2" w:uiPriority="47"/>
-    <w:lsdException w:name="List Table 3" w:uiPriority="48"/>
-    <w:lsdException w:name="List Table 4" w:uiPriority="49"/>
-    <w:lsdException w:name="List Table 5 Dark" w:uiPriority="50"/>
-    <w:lsdException w:name="List Table 6 Colorful" w:uiPriority="51"/>
-    <w:lsdException w:name="List Table 7 Colorful" w:uiPriority="52"/>
-    <w:lsdException w:name="List Table 1 Light Accent 1" w:uiPriority="46"/>
-    <w:lsdException w:name="List Table 2 Accent 1" w:uiPriority="47"/>
-    <w:lsdException w:name="List Table 3 Accent 1" w:uiPriority="48"/>
-    <w:lsdException w:name="List Table 4 Accent 1" w:uiPriority="49"/>
-    <w:lsdException w:name="List Table 5 Dark Accent 1" w:uiPriority="50"/>
-    <w:lsdException w:name="List Table 6 Colorful Accent 1" w:uiPriority="51"/>
-    <w:lsdException w:name="List Table 7 Colorful Accent 1" w:uiPriority="52"/>
-    <w:lsdException w:name="List Table 1 Light Accent 2" w:uiPriority="46"/>
-    <w:lsdException w:name="List Table 2 Accent 2" w:uiPriority="47"/>
-    <w:lsdException w:name="List Table 3 Accent 2" w:uiPriority="48"/>
-    <w:lsdException w:name="List Table 4 Accent 2" w:uiPriority="49"/>
-    <w:lsdException w:name="List Table 5 Dark Accent 2" w:uiPriority="50"/>
-    <w:lsdException w:name="List Table 6 Colorful Accent 2" w:uiPriority="51"/>
-    <w:lsdException w:name="List Table 7 Colorful Accent 2" w:uiPriority="52"/>
-    <w:lsdException w:name="List Table 1 Light Accent 3" w:uiPriority="46"/>
-    <w:lsdException w:name="List Table 2 Accent 3" w:uiPriority="47"/>
-    <w:lsdException w:name="List Table 3 Accent 3" w:uiPriority="48"/>
-    <w:lsdException w:name="List Table 4 Accent 3" w:uiPriority="49"/>
-    <w:lsdException w:name="List Table 5 Dark Accent 3" w:uiPriority="50"/>
-    <w:lsdException w:name="List Table 6 Colorful Accent 3" w:uiPriority="51"/>
-    <w:lsdException w:name="List Table 7 Colorful Accent 3" w:uiPriority="52"/>
-    <w:lsdException w:name="List Table 1 Light Accent 4" w:uiPriority="46"/>
-    <w:lsdException w:name="List Table 2 Accent 4" w:uiPriority="47"/>
-    <w:lsdException w:name="List Table 3 Accent 4" w:uiPriority="48"/>
-    <w:lsdException w:name="List Table 4 Accent 4" w:uiPriority="49"/>
-    <w:lsdException w:name="List Table 5 Dark Accent 4" w:uiPriority="50"/>
-    <w:lsdException w:name="List Table 6 Colorful Accent 4" w:uiPriority="51"/>
-    <w:lsdException w:name="List Table 7 Colorful Accent 4" w:uiPriority="52"/>
-    <w:lsdException w:name="List Table 1 Light Accent 5" w:uiPriority="46"/>
-    <w:lsdException w:name="List Table 2 Accent 5" w:uiPriority="47"/>
-    <w:lsdException w:name="List Table 3 Accent 5" w:uiPriority="48"/>
-    <w:lsdException w:name="List Table 4 Accent 5" w:uiPriority="49"/>
-    <w:lsdException w:name="List Table 5 Dark Accent 5" w:uiPriority="50"/>
-    <w:lsdException w:name="List Table 6 Colorful Accent 5" w:uiPriority="51"/>
-    <w:lsdException w:name="List Table 7 Colorful Accent 5" w:uiPriority="52"/>
-    <w:lsdException w:name="List Table 1 Light Accent 6" w:uiPriority="46"/>
-    <w:lsdException w:name="List Table 2 Accent 6" w:uiPriority="47"/>
-    <w:lsdException w:name="List Table 3 Accent 6" w:uiPriority="48"/>
-    <w:lsdException w:name="List Table 4 Accent 6" w:uiPriority="49"/>
-    <w:lsdException w:name="List Table 5 Dark Accent 6" w:uiPriority="50"/>
-    <w:lsdException w:name="List Table 6 Colorful Accent 6" w:uiPriority="51"/>
-    <w:lsdException w:name="List Table 7 Colorful Accent 6" w:uiPriority="52"/>
-    <w:lsdException w:name="Mention" w:semiHidden="1" w:unhideWhenUsed="1"/>
-    <w:lsdException w:name="Smart Hyperlink" w:semiHidden="1" w:unhideWhenUsed="1"/>
-    <w:lsdException w:name="Hashtag" w:semiHidden="1" w:unhideWhenUsed="1"/>
-    <w:lsdException w:name="Unresolved Mention" w:semiHidden="1" w:unhideWhenUsed="1"/>
-    <w:lsdException w:name="Smart Link" w:semiHidden="1" w:unhideWhenUsed="1"/>
-  </w:latentStyles>
-  <w:style w:type="paragraph" w:default="1" w:styleId="Normal">
-    <w:name w:val="Normal"/>
-    <w:qFormat/>
-    <w:rPr>
-      <w:rFonts w:ascii="Arial MT" w:eastAsia="Arial MT" w:hAnsi="Arial MT" w:cs="Arial MT"/>
-      <w:lang w:val="pt-PT"/>
-    </w:rPr>
-  </w:style>
-  <w:style w:type="paragraph" w:styleId="Ttulo1">
-    <w:name w:val="heading 1"/>
-    <w:basedOn w:val="Normal"/>
-    <w:link w:val="Ttulo1Char"/>
-    <w:uiPriority w:val="9"/>
-    <w:qFormat/>
-    <w:pPr>
-      <w:spacing w:before="62"/>
-      <w:outlineLvl w:val="0"/>
-    </w:pPr>
-    <w:rPr>
-      <w:rFonts w:ascii="Arial" w:eastAsia="Arial" w:hAnsi="Arial" w:cs="Arial"/>
-      <w:b/>
-      <w:bCs/>
-      <w:sz w:val="36"/>
-      <w:szCs w:val="36"/>
-    </w:rPr>
-  </w:style>
-  <w:style w:type="character" w:default="1" w:styleId="Fontepargpadro">
+  <w:style w:styleId="DefaultParagraphFont" w:default="1" w:type="character">
     <w:name w:val="Default Paragraph Font"/>
     <w:uiPriority w:val="1"/>
     <w:semiHidden/>
     <w:unhideWhenUsed/>
   </w:style>
-  <w:style w:type="table" w:default="1" w:styleId="Tabelanormal">
-    <w:name w:val="Normal Table"/>
-    <w:uiPriority w:val="99"/>
-    <w:semiHidden/>
-    <w:unhideWhenUsed/>
-    <w:tblPr>
-      <w:tblInd w:w="0" w:type="dxa"/>
-      <w:tblCellMar>
-        <w:top w:w="0" w:type="dxa"/>
-        <w:left w:w="108" w:type="dxa"/>
-        <w:bottom w:w="0" w:type="dxa"/>
-        <w:right w:w="108" w:type="dxa"/>
-      </w:tblCellMar>
-    </w:tblPr>
-  </w:style>
-  <w:style w:type="numbering" w:default="1" w:styleId="Semlista">
-    <w:name w:val="No List"/>
-    <w:uiPriority w:val="99"/>
-    <w:semiHidden/>
-    <w:unhideWhenUsed/>
-  </w:style>
-  <w:style w:type="table" w:customStyle="1" w:styleId="TableNormal">
+  <w:style w:styleId="TableNormal" w:default="1" w:type="table">
     <w:name w:val="Table Normal"/>
     <w:uiPriority w:val="2"/>
     <w:semiHidden/>
@@ -2100,7 +1784,23 @@
       </w:tblCellMar>
     </w:tblPr>
   </w:style>
-  <w:style w:type="paragraph" w:styleId="Corpodetexto">
+  <w:style w:styleId="NoList" w:default="1" w:type="numbering">
+    <w:name w:val="No List"/>
+    <w:uiPriority w:val="99"/>
+    <w:semiHidden/>
+    <w:unhideWhenUsed/>
+  </w:style>
+  <w:style w:default="1" w:styleId="Normal" w:type="paragraph">
+    <w:name w:val="Normal"/>
+    <w:uiPriority w:val="1"/>
+    <w:qFormat/>
+    <w:pPr/>
+    <w:rPr>
+      <w:rFonts w:ascii="Arial MT" w:hAnsi="Arial MT" w:eastAsia="Arial MT" w:cs="Arial MT"/>
+      <w:lang w:val="pt-PT" w:eastAsia="en-US" w:bidi="ar-SA"/>
+    </w:rPr>
+  </w:style>
+  <w:style w:styleId="BodyText" w:type="paragraph">
     <w:name w:val="Body Text"/>
     <w:basedOn w:val="Normal"/>
     <w:uiPriority w:val="1"/>
@@ -2108,8 +1808,32 @@
     <w:pPr>
       <w:spacing w:before="67"/>
     </w:pPr>
+    <w:rPr>
+      <w:rFonts w:ascii="Arial MT" w:hAnsi="Arial MT" w:eastAsia="Arial MT" w:cs="Arial MT"/>
+      <w:sz w:val="22"/>
+      <w:szCs w:val="22"/>
+      <w:lang w:val="pt-PT" w:eastAsia="en-US" w:bidi="ar-SA"/>
+    </w:rPr>
   </w:style>
-  <w:style w:type="paragraph" w:styleId="PargrafodaLista">
+  <w:style w:styleId="Heading1" w:type="paragraph">
+    <w:name w:val="Heading 1"/>
+    <w:basedOn w:val="Normal"/>
+    <w:uiPriority w:val="1"/>
+    <w:qFormat/>
+    <w:pPr>
+      <w:spacing w:before="62"/>
+      <w:outlineLvl w:val="1"/>
+    </w:pPr>
+    <w:rPr>
+      <w:rFonts w:ascii="Arial" w:hAnsi="Arial" w:eastAsia="Arial" w:cs="Arial"/>
+      <w:b/>
+      <w:bCs/>
+      <w:sz w:val="36"/>
+      <w:szCs w:val="36"/>
+      <w:lang w:val="pt-PT" w:eastAsia="en-US" w:bidi="ar-SA"/>
+    </w:rPr>
+  </w:style>
+  <w:style w:styleId="ListParagraph" w:type="paragraph">
     <w:name w:val="List Paragraph"/>
     <w:basedOn w:val="Normal"/>
     <w:uiPriority w:val="1"/>
@@ -2118,8 +1842,12 @@
       <w:spacing w:before="67"/>
       <w:ind w:left="254" w:hanging="134"/>
     </w:pPr>
+    <w:rPr>
+      <w:rFonts w:ascii="Arial MT" w:hAnsi="Arial MT" w:eastAsia="Arial MT" w:cs="Arial MT"/>
+      <w:lang w:val="pt-PT" w:eastAsia="en-US" w:bidi="ar-SA"/>
+    </w:rPr>
   </w:style>
-  <w:style w:type="paragraph" w:customStyle="1" w:styleId="TableParagraph">
+  <w:style w:styleId="TableParagraph" w:type="paragraph">
     <w:name w:val="Table Paragraph"/>
     <w:basedOn w:val="Normal"/>
     <w:uiPriority w:val="1"/>
@@ -2128,20 +1856,9 @@
       <w:spacing w:before="106"/>
       <w:ind w:left="160"/>
     </w:pPr>
-  </w:style>
-  <w:style w:type="character" w:customStyle="1" w:styleId="Ttulo1Char">
-    <w:name w:val="Título 1 Char"/>
-    <w:basedOn w:val="Fontepargpadro"/>
-    <w:link w:val="Ttulo1"/>
-    <w:uiPriority w:val="9"/>
-    <w:rsid w:val="00786397"/>
     <w:rPr>
-      <w:rFonts w:ascii="Arial" w:eastAsia="Arial" w:hAnsi="Arial" w:cs="Arial"/>
-      <w:b/>
-      <w:bCs/>
-      <w:sz w:val="36"/>
-      <w:szCs w:val="36"/>
-      <w:lang w:val="pt-PT"/>
+      <w:rFonts w:ascii="Arial MT" w:hAnsi="Arial MT" w:eastAsia="Arial MT" w:cs="Arial MT"/>
+      <w:lang w:val="pt-PT" w:eastAsia="en-US" w:bidi="ar-SA"/>
     </w:rPr>
   </w:style>
 </w:styles>

</xml_diff>